<commit_message>
Correção dos arquivos de registro
</commit_message>
<xml_diff>
--- a/gestão/CIVIS_documentacao_registro.docx
+++ b/gestão/CIVIS_documentacao_registro.docx
@@ -482,21 +482,33 @@
         <w:r>
           <w:rPr>
             <w:rFonts w:ascii="Arial" w:hAnsi="Arial" w:cs="Arial"/>
-            <w:b/>
+            <w:bCs/>
+            <w:rPrChange w:id="3" w:author="BRUNO KAUAN RODRIGUES SILVA" w:date="2025-07-17T16:58:00Z" w16du:dateUtc="2025-07-17T19:58:00Z">
+              <w:rPr>
+                <w:rFonts w:ascii="Arial" w:hAnsi="Arial" w:cs="Arial"/>
+                <w:b/>
+              </w:rPr>
+            </w:rPrChange>
           </w:rPr>
           <w:t>CIVIS</w:t>
         </w:r>
       </w:ins>
-      <w:ins w:id="3" w:author="PeepT ㅤ" w:date="2025-06-13T12:04:00Z">
-        <w:r>
-          <w:rPr>
-            <w:rFonts w:ascii="Arial" w:hAnsi="Arial" w:cs="Arial"/>
-            <w:b/>
+      <w:ins w:id="4" w:author="PeepT ㅤ" w:date="2025-06-13T12:04:00Z">
+        <w:r>
+          <w:rPr>
+            <w:rFonts w:ascii="Arial" w:hAnsi="Arial" w:cs="Arial"/>
+            <w:bCs/>
+            <w:rPrChange w:id="5" w:author="BRUNO KAUAN RODRIGUES SILVA" w:date="2025-07-17T16:58:00Z" w16du:dateUtc="2025-07-17T19:58:00Z">
+              <w:rPr>
+                <w:rFonts w:ascii="Arial" w:hAnsi="Arial" w:cs="Arial"/>
+                <w:b/>
+              </w:rPr>
+            </w:rPrChange>
           </w:rPr>
           <w:t xml:space="preserve"> Vistoria</w:t>
         </w:r>
       </w:ins>
-      <w:ins w:id="4" w:author="PeepT ㅤ" w:date="2025-06-13T12:02:00Z">
+      <w:ins w:id="6" w:author="PeepT ㅤ" w:date="2025-06-13T12:02:00Z">
         <w:r>
           <w:rPr>
             <w:rFonts w:ascii="Arial" w:hAnsi="Arial" w:cs="Arial"/>
@@ -521,6 +533,21 @@
         </w:rPr>
         <w:t xml:space="preserve">Data Criação: </w:t>
       </w:r>
+      <w:ins w:id="7" w:author="BRUNO KAUAN RODRIGUES SILVA" w:date="2025-07-17T16:46:00Z">
+        <w:r>
+          <w:rPr>
+            <w:rFonts w:ascii="Arial" w:hAnsi="Arial" w:cs="Arial"/>
+            <w:rPrChange w:id="8" w:author="BRUNO KAUAN RODRIGUES SILVA" w:date="2025-07-17T16:58:00Z" w16du:dateUtc="2025-07-17T19:58:00Z">
+              <w:rPr>
+                <w:rFonts w:ascii="Arial" w:hAnsi="Arial" w:cs="Arial"/>
+                <w:b/>
+                <w:bCs/>
+              </w:rPr>
+            </w:rPrChange>
+          </w:rPr>
+          <w:t>22/05/2025</w:t>
+        </w:r>
+      </w:ins>
     </w:p>
     <w:p>
       <w:pPr>
@@ -535,7 +562,36 @@
           <w:rFonts w:ascii="Arial" w:hAnsi="Arial" w:cs="Arial"/>
           <w:b/>
         </w:rPr>
-        <w:t xml:space="preserve">Data de Publicação: </w:t>
+        <w:t>Data de Publicação:</w:t>
+      </w:r>
+      <w:ins w:id="9" w:author="BRUNO KAUAN RODRIGUES SILVA" w:date="2025-07-17T16:56:00Z" w16du:dateUtc="2025-07-17T19:56:00Z">
+        <w:r>
+          <w:rPr>
+            <w:rFonts w:ascii="Arial" w:hAnsi="Arial" w:cs="Arial"/>
+            <w:b/>
+          </w:rPr>
+          <w:t xml:space="preserve"> </w:t>
+        </w:r>
+        <w:r>
+          <w:rPr>
+            <w:rFonts w:ascii="Arial" w:hAnsi="Arial" w:cs="Arial"/>
+            <w:bCs/>
+            <w:rPrChange w:id="10" w:author="BRUNO KAUAN RODRIGUES SILVA" w:date="2025-07-17T16:58:00Z" w16du:dateUtc="2025-07-17T19:58:00Z">
+              <w:rPr>
+                <w:rFonts w:ascii="Arial" w:hAnsi="Arial" w:cs="Arial"/>
+                <w:b/>
+              </w:rPr>
+            </w:rPrChange>
+          </w:rPr>
+          <w:t>17/07/2025</w:t>
+        </w:r>
+      </w:ins>
+      <w:r>
+        <w:rPr>
+          <w:rFonts w:ascii="Arial" w:hAnsi="Arial" w:cs="Arial"/>
+          <w:b/>
+        </w:rPr>
+        <w:t xml:space="preserve"> </w:t>
       </w:r>
     </w:p>
     <w:p>
@@ -577,6 +633,24 @@
         </w:rPr>
         <w:t>:</w:t>
       </w:r>
+      <w:ins w:id="11" w:author="BRUNO KAUAN RODRIGUES SILVA" w:date="2025-07-17T16:56:00Z" w16du:dateUtc="2025-07-17T19:56:00Z">
+        <w:r>
+          <w:t xml:space="preserve"> </w:t>
+        </w:r>
+        <w:r>
+          <w:rPr>
+            <w:rFonts w:ascii="Arial" w:hAnsi="Arial" w:cs="Arial"/>
+            <w:bCs/>
+            <w:rPrChange w:id="12" w:author="BRUNO KAUAN RODRIGUES SILVA" w:date="2025-07-17T16:58:00Z" w16du:dateUtc="2025-07-17T19:58:00Z">
+              <w:rPr>
+                <w:rFonts w:ascii="Arial" w:hAnsi="Arial" w:cs="Arial"/>
+                <w:b/>
+              </w:rPr>
+            </w:rPrChange>
+          </w:rPr>
+          <w:t>SHA-512</w:t>
+        </w:r>
+      </w:ins>
     </w:p>
     <w:p>
       <w:pPr>
@@ -592,8 +666,46 @@
           <w:rFonts w:ascii="Arial" w:hAnsi="Arial" w:cs="Arial"/>
           <w:b/>
         </w:rPr>
-        <w:t>Resumo digital Hash:</w:t>
+        <w:t xml:space="preserve">Resumo digital </w:t>
       </w:r>
+      <w:proofErr w:type="spellStart"/>
+      <w:r>
+        <w:rPr>
+          <w:rFonts w:ascii="Arial" w:hAnsi="Arial" w:cs="Arial"/>
+          <w:b/>
+        </w:rPr>
+        <w:t>Hash</w:t>
+      </w:r>
+      <w:proofErr w:type="spellEnd"/>
+      <w:r>
+        <w:rPr>
+          <w:rFonts w:ascii="Arial" w:hAnsi="Arial" w:cs="Arial"/>
+          <w:b/>
+        </w:rPr>
+        <w:t>:</w:t>
+      </w:r>
+      <w:ins w:id="13" w:author="BRUNO KAUAN RODRIGUES SILVA" w:date="2025-07-17T16:56:00Z" w16du:dateUtc="2025-07-17T19:56:00Z">
+        <w:r>
+          <w:rPr>
+            <w:rFonts w:ascii="Arial" w:hAnsi="Arial" w:cs="Arial"/>
+            <w:b/>
+          </w:rPr>
+          <w:t xml:space="preserve"> </w:t>
+        </w:r>
+        <w:r>
+          <w:rPr>
+            <w:rFonts w:ascii="Arial" w:hAnsi="Arial" w:cs="Arial"/>
+            <w:bCs/>
+            <w:rPrChange w:id="14" w:author="BRUNO KAUAN RODRIGUES SILVA" w:date="2025-07-17T16:58:00Z" w16du:dateUtc="2025-07-17T19:58:00Z">
+              <w:rPr>
+                <w:rFonts w:ascii="Arial" w:hAnsi="Arial" w:cs="Arial"/>
+                <w:b/>
+              </w:rPr>
+            </w:rPrChange>
+          </w:rPr>
+          <w:t>hash.txt</w:t>
+        </w:r>
+      </w:ins>
     </w:p>
     <w:p>
       <w:pPr>
@@ -612,21 +724,33 @@
         <w:t xml:space="preserve">Linguagem: </w:t>
       </w:r>
       <w:proofErr w:type="spellStart"/>
-      <w:ins w:id="5" w:author="PeepT ㅤ" w:date="2025-06-13T12:02:00Z">
-        <w:r>
-          <w:rPr>
-            <w:rFonts w:ascii="Arial" w:hAnsi="Arial" w:cs="Arial"/>
-            <w:b/>
+      <w:ins w:id="15" w:author="PeepT ㅤ" w:date="2025-06-13T12:02:00Z">
+        <w:r>
+          <w:rPr>
+            <w:rFonts w:ascii="Arial" w:hAnsi="Arial" w:cs="Arial"/>
+            <w:bCs/>
+            <w:rPrChange w:id="16" w:author="BRUNO KAUAN RODRIGUES SILVA" w:date="2025-07-17T16:58:00Z" w16du:dateUtc="2025-07-17T19:58:00Z">
+              <w:rPr>
+                <w:rFonts w:ascii="Arial" w:hAnsi="Arial" w:cs="Arial"/>
+                <w:b/>
+              </w:rPr>
+            </w:rPrChange>
           </w:rPr>
           <w:t>React</w:t>
         </w:r>
       </w:ins>
       <w:proofErr w:type="spellEnd"/>
-      <w:ins w:id="6" w:author="BRUNO KAUAN RODRIGUES SILVA" w:date="2025-06-13T18:11:00Z" w16du:dateUtc="2025-06-13T21:11:00Z">
-        <w:r>
-          <w:rPr>
-            <w:rFonts w:ascii="Arial" w:hAnsi="Arial" w:cs="Arial"/>
-            <w:b/>
+      <w:ins w:id="17" w:author="BRUNO KAUAN RODRIGUES SILVA" w:date="2025-06-13T18:11:00Z" w16du:dateUtc="2025-06-13T21:11:00Z">
+        <w:r>
+          <w:rPr>
+            <w:rFonts w:ascii="Arial" w:hAnsi="Arial" w:cs="Arial"/>
+            <w:bCs/>
+            <w:rPrChange w:id="18" w:author="BRUNO KAUAN RODRIGUES SILVA" w:date="2025-07-17T16:58:00Z" w16du:dateUtc="2025-07-17T19:58:00Z">
+              <w:rPr>
+                <w:rFonts w:ascii="Arial" w:hAnsi="Arial" w:cs="Arial"/>
+                <w:b/>
+              </w:rPr>
+            </w:rPrChange>
           </w:rPr>
           <w:t xml:space="preserve"> </w:t>
         </w:r>
@@ -634,9 +758,45 @@
         <w:r>
           <w:rPr>
             <w:rFonts w:ascii="Arial" w:hAnsi="Arial" w:cs="Arial"/>
-            <w:b/>
+            <w:bCs/>
+            <w:rPrChange w:id="19" w:author="BRUNO KAUAN RODRIGUES SILVA" w:date="2025-07-17T16:58:00Z" w16du:dateUtc="2025-07-17T19:58:00Z">
+              <w:rPr>
+                <w:rFonts w:ascii="Arial" w:hAnsi="Arial" w:cs="Arial"/>
+                <w:b/>
+              </w:rPr>
+            </w:rPrChange>
           </w:rPr>
           <w:t>Native</w:t>
+        </w:r>
+      </w:ins>
+      <w:proofErr w:type="spellEnd"/>
+      <w:ins w:id="20" w:author="BRUNO KAUAN RODRIGUES SILVA" w:date="2025-07-17T16:58:00Z" w16du:dateUtc="2025-07-17T19:58:00Z">
+        <w:r>
+          <w:rPr>
+            <w:rFonts w:ascii="Arial" w:hAnsi="Arial" w:cs="Arial"/>
+            <w:bCs/>
+            <w:rPrChange w:id="21" w:author="BRUNO KAUAN RODRIGUES SILVA" w:date="2025-07-17T16:58:00Z" w16du:dateUtc="2025-07-17T19:58:00Z">
+              <w:rPr>
+                <w:rFonts w:ascii="Arial" w:hAnsi="Arial" w:cs="Arial"/>
+                <w:b/>
+              </w:rPr>
+            </w:rPrChange>
+          </w:rPr>
+          <w:t xml:space="preserve"> e </w:t>
+        </w:r>
+        <w:proofErr w:type="spellStart"/>
+        <w:r>
+          <w:rPr>
+            <w:rFonts w:ascii="Arial" w:hAnsi="Arial" w:cs="Arial"/>
+            <w:bCs/>
+            <w:rPrChange w:id="22" w:author="BRUNO KAUAN RODRIGUES SILVA" w:date="2025-07-17T16:58:00Z" w16du:dateUtc="2025-07-17T19:58:00Z">
+              <w:rPr>
+                <w:rFonts w:ascii="Arial" w:hAnsi="Arial" w:cs="Arial"/>
+                <w:b/>
+              </w:rPr>
+            </w:rPrChange>
+          </w:rPr>
+          <w:t>JavaScript</w:t>
         </w:r>
       </w:ins>
       <w:proofErr w:type="spellEnd"/>
@@ -665,7 +825,7 @@
         </w:rPr>
         <w:t>o:</w:t>
       </w:r>
-      <w:ins w:id="7" w:author="PeepT ㅤ" w:date="2025-06-13T11:24:00Z">
+      <w:ins w:id="23" w:author="PeepT ㅤ" w:date="2025-06-13T11:24:00Z">
         <w:r>
           <w:rPr>
             <w:rFonts w:ascii="Arial" w:hAnsi="Arial" w:cs="Arial"/>
@@ -676,14 +836,14 @@
         <w:r>
           <w:rPr>
             <w:rFonts w:ascii="Arial" w:hAnsi="Arial" w:cs="Arial"/>
-            <w:rPrChange w:id="8" w:author="PeepT ㅤ" w:date="2025-06-13T11:34:00Z">
+            <w:rPrChange w:id="24" w:author="PeepT ㅤ" w:date="2025-06-13T11:34:00Z">
               <w:rPr/>
             </w:rPrChange>
           </w:rPr>
           <w:t>CC03-Org</w:t>
         </w:r>
       </w:ins>
-      <w:ins w:id="9" w:author="BRUNO KAUAN RODRIGUES SILVA" w:date="2025-06-13T18:31:00Z" w16du:dateUtc="2025-06-13T21:31:00Z">
+      <w:ins w:id="25" w:author="BRUNO KAUAN RODRIGUES SILVA" w:date="2025-06-13T18:31:00Z" w16du:dateUtc="2025-06-13T21:31:00Z">
         <w:r>
           <w:rPr>
             <w:rFonts w:ascii="Arial" w:hAnsi="Arial" w:cs="Arial"/>
@@ -699,12 +859,12 @@
         </w:r>
       </w:ins>
       <w:proofErr w:type="spellEnd"/>
-      <w:ins w:id="10" w:author="PeepT ㅤ" w:date="2025-06-13T11:24:00Z">
-        <w:del w:id="11" w:author="BRUNO KAUAN RODRIGUES SILVA" w:date="2025-06-13T18:06:00Z" w16du:dateUtc="2025-06-13T21:06:00Z">
+      <w:ins w:id="26" w:author="PeepT ㅤ" w:date="2025-06-13T11:24:00Z">
+        <w:del w:id="27" w:author="BRUNO KAUAN RODRIGUES SILVA" w:date="2025-06-13T18:06:00Z" w16du:dateUtc="2025-06-13T21:06:00Z">
           <w:r>
             <w:rPr>
               <w:rFonts w:ascii="Arial" w:hAnsi="Arial" w:cs="Arial"/>
-              <w:rPrChange w:id="12" w:author="PeepT ㅤ" w:date="2025-06-13T11:34:00Z">
+              <w:rPrChange w:id="28" w:author="PeepT ㅤ" w:date="2025-06-13T11:34:00Z">
                 <w:rPr/>
               </w:rPrChange>
             </w:rPr>
@@ -712,7 +872,7 @@
           </w:r>
         </w:del>
       </w:ins>
-      <w:del w:id="13" w:author="PeepT ㅤ" w:date="2025-06-13T11:24:00Z">
+      <w:del w:id="29" w:author="PeepT ㅤ" w:date="2025-06-13T11:24:00Z">
         <w:r>
           <w:fldChar w:fldCharType="begin"/>
         </w:r>
@@ -769,12 +929,12 @@
         </w:rPr>
         <w:t>Tipo de Programa:</w:t>
       </w:r>
-      <w:ins w:id="14" w:author="BRUNO KAUAN RODRIGUES SILVA" w:date="2025-06-13T18:13:00Z" w16du:dateUtc="2025-06-13T21:13:00Z">
+      <w:ins w:id="30" w:author="BRUNO KAUAN RODRIGUES SILVA" w:date="2025-06-13T18:13:00Z" w16du:dateUtc="2025-06-13T21:13:00Z">
         <w:r>
           <w:rPr>
             <w:rFonts w:ascii="Arial" w:hAnsi="Arial" w:cs="Arial"/>
             <w:bCs/>
-            <w:rPrChange w:id="15" w:author="BRUNO KAUAN RODRIGUES SILVA" w:date="2025-06-13T18:20:00Z" w16du:dateUtc="2025-06-13T21:20:00Z">
+            <w:rPrChange w:id="31" w:author="BRUNO KAUAN RODRIGUES SILVA" w:date="2025-06-13T18:20:00Z" w16du:dateUtc="2025-06-13T21:20:00Z">
               <w:rPr>
                 <w:rFonts w:ascii="Arial" w:hAnsi="Arial" w:cs="Arial"/>
                 <w:b/>
@@ -784,22 +944,16 @@
           <w:t xml:space="preserve"> </w:t>
         </w:r>
       </w:ins>
-      <w:ins w:id="16" w:author="BRUNO KAUAN RODRIGUES SILVA" w:date="2025-06-13T18:20:00Z">
+      <w:ins w:id="32" w:author="BRUNO KAUAN RODRIGUES SILVA" w:date="2025-07-17T16:18:00Z">
         <w:r>
           <w:rPr>
             <w:rFonts w:ascii="Arial" w:hAnsi="Arial" w:cs="Arial"/>
             <w:bCs/>
-            <w:rPrChange w:id="17" w:author="BRUNO KAUAN RODRIGUES SILVA" w:date="2025-06-13T18:20:00Z" w16du:dateUtc="2025-06-13T21:20:00Z">
-              <w:rPr>
-                <w:rFonts w:ascii="Arial" w:hAnsi="Arial" w:cs="Arial"/>
-                <w:b/>
-              </w:rPr>
-            </w:rPrChange>
-          </w:rPr>
-          <w:t>Sistema de Gestão de Vistorias</w:t>
+          </w:rPr>
+          <w:t>UT01-Utilitários</w:t>
         </w:r>
       </w:ins>
-      <w:del w:id="18" w:author="BRUNO KAUAN RODRIGUES SILVA" w:date="2025-06-13T18:13:00Z" w16du:dateUtc="2025-06-13T21:13:00Z">
+      <w:del w:id="33" w:author="BRUNO KAUAN RODRIGUES SILVA" w:date="2025-06-13T18:13:00Z" w16du:dateUtc="2025-06-13T21:13:00Z">
         <w:r>
           <w:rPr>
             <w:rFonts w:ascii="Arial" w:hAnsi="Arial" w:cs="Arial"/>
@@ -836,7 +990,7 @@
         <w:spacing w:before="119" w:line="360" w:lineRule="auto"/>
         <w:ind w:right="295"/>
         <w:rPr>
-          <w:ins w:id="19" w:author="PeepT ㅤ" w:date="2025-06-13T12:04:00Z"/>
+          <w:ins w:id="34" w:author="PeepT ㅤ" w:date="2025-06-13T12:04:00Z"/>
           <w:rFonts w:ascii="Arial" w:hAnsi="Arial" w:cs="Arial"/>
           <w:b/>
           <w:bCs/>
@@ -849,7 +1003,7 @@
         <w:spacing w:before="119" w:line="360" w:lineRule="auto"/>
         <w:ind w:right="295"/>
         <w:rPr>
-          <w:ins w:id="20" w:author="PeepT ㅤ" w:date="2025-06-13T12:04:00Z"/>
+          <w:ins w:id="35" w:author="PeepT ㅤ" w:date="2025-06-13T12:04:00Z"/>
           <w:rFonts w:ascii="Arial" w:hAnsi="Arial" w:cs="Arial"/>
           <w:b/>
           <w:bCs/>
@@ -885,21 +1039,21 @@
         <w:ind w:firstLine="709"/>
         <w:jc w:val="both"/>
         <w:rPr>
-          <w:del w:id="21" w:author="PeepT ㅤ" w:date="2025-06-13T12:04:00Z"/>
+          <w:del w:id="36" w:author="PeepT ㅤ" w:date="2025-06-13T12:04:00Z"/>
           <w:rFonts w:ascii="Arial" w:hAnsi="Arial" w:cs="Arial"/>
           <w:i/>
           <w:iCs/>
           <w:color w:val="808080" w:themeColor="background1" w:themeShade="80"/>
         </w:rPr>
-        <w:pPrChange w:id="22" w:author="BRUNO KAUAN RODRIGUES SILVA" w:date="2025-06-13T18:05:00Z" w16du:dateUtc="2025-06-13T21:05:00Z">
+        <w:pPrChange w:id="37" w:author="BRUNO KAUAN RODRIGUES SILVA" w:date="2025-06-13T18:05:00Z" w16du:dateUtc="2025-06-13T21:05:00Z">
           <w:pPr/>
         </w:pPrChange>
       </w:pPr>
-      <w:ins w:id="23" w:author="PeepT ㅤ" w:date="2025-06-13T12:04:00Z">
-        <w:r>
-          <w:rPr>
-            <w:rFonts w:ascii="Arial" w:hAnsi="Arial" w:cs="Arial"/>
-            <w:rPrChange w:id="24" w:author="PeepT ㅤ" w:date="2025-06-13T12:04:00Z">
+      <w:ins w:id="38" w:author="PeepT ㅤ" w:date="2025-06-13T12:04:00Z">
+        <w:r>
+          <w:rPr>
+            <w:rFonts w:ascii="Arial" w:hAnsi="Arial" w:cs="Arial"/>
+            <w:rPrChange w:id="39" w:author="PeepT ㅤ" w:date="2025-06-13T12:04:00Z">
               <w:rPr/>
             </w:rPrChange>
           </w:rPr>
@@ -911,7 +1065,7 @@
             <w:rFonts w:ascii="Arial" w:hAnsi="Arial" w:cs="Arial"/>
             <w:b w:val="0"/>
             <w:bCs w:val="0"/>
-            <w:rPrChange w:id="25" w:author="PeepT ㅤ" w:date="2025-06-13T12:04:00Z">
+            <w:rPrChange w:id="40" w:author="PeepT ㅤ" w:date="2025-06-13T12:04:00Z">
               <w:rPr>
                 <w:rStyle w:val="Forte"/>
               </w:rPr>
@@ -922,7 +1076,7 @@
         <w:r>
           <w:rPr>
             <w:rFonts w:ascii="Arial" w:hAnsi="Arial" w:cs="Arial"/>
-            <w:rPrChange w:id="26" w:author="PeepT ㅤ" w:date="2025-06-13T12:04:00Z">
+            <w:rPrChange w:id="41" w:author="PeepT ㅤ" w:date="2025-06-13T12:04:00Z">
               <w:rPr/>
             </w:rPrChange>
           </w:rPr>
@@ -934,7 +1088,7 @@
             <w:rFonts w:ascii="Arial" w:hAnsi="Arial" w:cs="Arial"/>
             <w:b w:val="0"/>
             <w:bCs w:val="0"/>
-            <w:rPrChange w:id="27" w:author="PeepT ㅤ" w:date="2025-06-13T12:04:00Z">
+            <w:rPrChange w:id="42" w:author="PeepT ㅤ" w:date="2025-06-13T12:04:00Z">
               <w:rPr>
                 <w:rStyle w:val="Forte"/>
               </w:rPr>
@@ -945,7 +1099,7 @@
         <w:r>
           <w:rPr>
             <w:rFonts w:ascii="Arial" w:hAnsi="Arial" w:cs="Arial"/>
-            <w:rPrChange w:id="28" w:author="PeepT ㅤ" w:date="2025-06-13T12:04:00Z">
+            <w:rPrChange w:id="43" w:author="PeepT ㅤ" w:date="2025-06-13T12:04:00Z">
               <w:rPr/>
             </w:rPrChange>
           </w:rPr>
@@ -957,7 +1111,7 @@
             <w:rFonts w:ascii="Arial" w:hAnsi="Arial" w:cs="Arial"/>
             <w:b w:val="0"/>
             <w:bCs w:val="0"/>
-            <w:rPrChange w:id="29" w:author="PeepT ㅤ" w:date="2025-06-13T12:04:00Z">
+            <w:rPrChange w:id="44" w:author="PeepT ㅤ" w:date="2025-06-13T12:04:00Z">
               <w:rPr>
                 <w:rStyle w:val="Forte"/>
               </w:rPr>
@@ -968,7 +1122,7 @@
         <w:r>
           <w:rPr>
             <w:rFonts w:ascii="Arial" w:hAnsi="Arial" w:cs="Arial"/>
-            <w:rPrChange w:id="30" w:author="PeepT ㅤ" w:date="2025-06-13T12:04:00Z">
+            <w:rPrChange w:id="45" w:author="PeepT ㅤ" w:date="2025-06-13T12:04:00Z">
               <w:rPr/>
             </w:rPrChange>
           </w:rPr>
@@ -980,7 +1134,7 @@
             <w:rFonts w:ascii="Arial" w:hAnsi="Arial" w:cs="Arial"/>
             <w:b w:val="0"/>
             <w:bCs w:val="0"/>
-            <w:rPrChange w:id="31" w:author="PeepT ㅤ" w:date="2025-06-13T12:04:00Z">
+            <w:rPrChange w:id="46" w:author="PeepT ㅤ" w:date="2025-06-13T12:04:00Z">
               <w:rPr>
                 <w:rStyle w:val="Forte"/>
               </w:rPr>
@@ -991,14 +1145,14 @@
         <w:r>
           <w:rPr>
             <w:rFonts w:ascii="Arial" w:hAnsi="Arial" w:cs="Arial"/>
-            <w:rPrChange w:id="32" w:author="PeepT ㅤ" w:date="2025-06-13T12:04:00Z">
+            <w:rPrChange w:id="47" w:author="PeepT ㅤ" w:date="2025-06-13T12:04:00Z">
               <w:rPr/>
             </w:rPrChange>
           </w:rPr>
           <w:t xml:space="preserve"> do processo de vistoria, substituindo métodos manuais por uma solução digital integrada e segura.</w:t>
         </w:r>
       </w:ins>
-      <w:del w:id="33" w:author="PeepT ㅤ" w:date="2025-06-13T12:04:00Z">
+      <w:del w:id="48" w:author="PeepT ㅤ" w:date="2025-06-13T12:04:00Z">
         <w:r>
           <w:rPr>
             <w:rFonts w:ascii="Arial" w:hAnsi="Arial" w:cs="Arial"/>
@@ -1017,7 +1171,7 @@
         <w:jc w:val="both"/>
         <w:rPr>
           <w:rFonts w:ascii="Arial" w:hAnsi="Arial" w:cs="Arial"/>
-          <w:rPrChange w:id="34" w:author="PeepT ㅤ" w:date="2025-06-13T12:04:00Z">
+          <w:rPrChange w:id="49" w:author="PeepT ㅤ" w:date="2025-06-13T12:04:00Z">
             <w:rPr>
               <w:rFonts w:ascii="Arial" w:hAnsi="Arial" w:cs="Arial"/>
               <w:b/>
@@ -1025,7 +1179,7 @@
             </w:rPr>
           </w:rPrChange>
         </w:rPr>
-        <w:pPrChange w:id="35" w:author="BRUNO KAUAN RODRIGUES SILVA" w:date="2025-06-13T18:05:00Z" w16du:dateUtc="2025-06-13T21:05:00Z">
+        <w:pPrChange w:id="50" w:author="BRUNO KAUAN RODRIGUES SILVA" w:date="2025-06-13T18:05:00Z" w16du:dateUtc="2025-06-13T21:05:00Z">
           <w:pPr/>
         </w:pPrChange>
       </w:pPr>
@@ -1063,15 +1217,15 @@
         <w:ind w:right="295" w:firstLine="709"/>
         <w:jc w:val="both"/>
         <w:rPr>
-          <w:del w:id="36" w:author="PeepT ㅤ" w:date="2025-06-13T11:34:00Z"/>
-          <w:rFonts w:ascii="Arial" w:hAnsi="Arial" w:cs="Arial"/>
-        </w:rPr>
-      </w:pPr>
-      <w:ins w:id="37" w:author="PeepT ㅤ" w:date="2025-06-13T11:38:00Z">
-        <w:r>
-          <w:rPr>
-            <w:rFonts w:ascii="Arial" w:hAnsi="Arial" w:cs="Arial"/>
-            <w:rPrChange w:id="38" w:author="PeepT ㅤ" w:date="2025-06-13T11:38:00Z">
+          <w:del w:id="51" w:author="PeepT ㅤ" w:date="2025-06-13T11:34:00Z"/>
+          <w:rFonts w:ascii="Arial" w:hAnsi="Arial" w:cs="Arial"/>
+        </w:rPr>
+      </w:pPr>
+      <w:ins w:id="52" w:author="PeepT ㅤ" w:date="2025-06-13T11:38:00Z">
+        <w:r>
+          <w:rPr>
+            <w:rFonts w:ascii="Arial" w:hAnsi="Arial" w:cs="Arial"/>
+            <w:rPrChange w:id="53" w:author="PeepT ㅤ" w:date="2025-06-13T11:38:00Z">
               <w:rPr/>
             </w:rPrChange>
           </w:rPr>
@@ -1083,7 +1237,7 @@
             <w:rFonts w:ascii="Arial" w:hAnsi="Arial" w:cs="Arial"/>
             <w:b w:val="0"/>
             <w:bCs w:val="0"/>
-            <w:rPrChange w:id="39" w:author="PeepT ㅤ" w:date="2025-06-13T11:38:00Z">
+            <w:rPrChange w:id="54" w:author="PeepT ㅤ" w:date="2025-06-13T11:38:00Z">
               <w:rPr>
                 <w:rStyle w:val="Forte"/>
               </w:rPr>
@@ -1094,7 +1248,7 @@
         <w:r>
           <w:rPr>
             <w:rFonts w:ascii="Arial" w:hAnsi="Arial" w:cs="Arial"/>
-            <w:rPrChange w:id="40" w:author="PeepT ㅤ" w:date="2025-06-13T11:38:00Z">
+            <w:rPrChange w:id="55" w:author="PeepT ㅤ" w:date="2025-06-13T11:38:00Z">
               <w:rPr/>
             </w:rPrChange>
           </w:rPr>
@@ -1106,7 +1260,7 @@
             <w:rFonts w:ascii="Arial" w:hAnsi="Arial" w:cs="Arial"/>
             <w:b w:val="0"/>
             <w:bCs w:val="0"/>
-            <w:rPrChange w:id="41" w:author="PeepT ㅤ" w:date="2025-06-13T11:38:00Z">
+            <w:rPrChange w:id="56" w:author="PeepT ㅤ" w:date="2025-06-13T11:38:00Z">
               <w:rPr>
                 <w:rStyle w:val="Forte"/>
               </w:rPr>
@@ -1117,14 +1271,14 @@
         <w:r>
           <w:rPr>
             <w:rFonts w:ascii="Arial" w:hAnsi="Arial" w:cs="Arial"/>
-            <w:rPrChange w:id="42" w:author="PeepT ㅤ" w:date="2025-06-13T11:38:00Z">
+            <w:rPrChange w:id="57" w:author="PeepT ㅤ" w:date="2025-06-13T11:38:00Z">
               <w:rPr/>
             </w:rPrChange>
           </w:rPr>
           <w:t xml:space="preserve"> com base nas respostas dos checklists, oferecendo documentação clara, padronizada e rastreável sobre o estado do imóvel vistoriado.</w:t>
         </w:r>
       </w:ins>
-      <w:del w:id="43" w:author="PeepT ㅤ" w:date="2025-06-13T11:34:00Z">
+      <w:del w:id="58" w:author="PeepT ㅤ" w:date="2025-06-13T11:34:00Z">
         <w:r>
           <w:rPr>
             <w:rFonts w:ascii="Arial" w:hAnsi="Arial" w:cs="Arial"/>
@@ -1142,13 +1296,13 @@
         <w:ind w:firstLine="709"/>
         <w:jc w:val="both"/>
         <w:rPr>
-          <w:ins w:id="44" w:author="BRUNO KAUAN RODRIGUES SILVA" w:date="2025-06-13T18:06:00Z" w16du:dateUtc="2025-06-13T21:06:00Z"/>
+          <w:ins w:id="59" w:author="BRUNO KAUAN RODRIGUES SILVA" w:date="2025-06-13T18:06:00Z" w16du:dateUtc="2025-06-13T21:06:00Z"/>
           <w:rFonts w:ascii="Arial" w:hAnsi="Arial" w:cs="Arial"/>
           <w:i/>
           <w:iCs/>
           <w:color w:val="808080" w:themeColor="background1" w:themeShade="80"/>
         </w:rPr>
-        <w:pPrChange w:id="45" w:author="BRUNO KAUAN RODRIGUES SILVA" w:date="2025-06-13T18:05:00Z" w16du:dateUtc="2025-06-13T21:05:00Z">
+        <w:pPrChange w:id="60" w:author="BRUNO KAUAN RODRIGUES SILVA" w:date="2025-06-13T18:05:00Z" w16du:dateUtc="2025-06-13T21:05:00Z">
           <w:pPr>
             <w:spacing w:line="360" w:lineRule="auto"/>
           </w:pPr>
@@ -1167,7 +1321,7 @@
           <w:color w:val="555555"/>
           <w:shd w:val="clear" w:color="auto" w:fill="FFF4F4"/>
         </w:rPr>
-        <w:pPrChange w:id="46" w:author="BRUNO KAUAN RODRIGUES SILVA" w:date="2025-06-13T18:05:00Z" w16du:dateUtc="2025-06-13T21:05:00Z">
+        <w:pPrChange w:id="61" w:author="BRUNO KAUAN RODRIGUES SILVA" w:date="2025-06-13T18:05:00Z" w16du:dateUtc="2025-06-13T21:05:00Z">
           <w:pPr>
             <w:spacing w:before="119" w:line="360" w:lineRule="auto"/>
             <w:ind w:left="396" w:right="295"/>
@@ -1200,15 +1354,15 @@
         <w:ind w:firstLine="709"/>
         <w:jc w:val="both"/>
         <w:rPr>
-          <w:del w:id="47" w:author="PeepT ㅤ" w:date="2025-06-13T11:38:00Z"/>
-          <w:rFonts w:ascii="Arial" w:hAnsi="Arial" w:cs="Arial"/>
-        </w:rPr>
-      </w:pPr>
-      <w:ins w:id="48" w:author="PeepT ㅤ" w:date="2025-06-13T11:38:00Z">
-        <w:r>
-          <w:rPr>
-            <w:rFonts w:ascii="Arial" w:hAnsi="Arial" w:cs="Arial"/>
-            <w:rPrChange w:id="49" w:author="PeepT ㅤ" w:date="2025-06-13T11:38:00Z">
+          <w:del w:id="62" w:author="PeepT ㅤ" w:date="2025-06-13T11:38:00Z"/>
+          <w:rFonts w:ascii="Arial" w:hAnsi="Arial" w:cs="Arial"/>
+        </w:rPr>
+      </w:pPr>
+      <w:ins w:id="63" w:author="PeepT ㅤ" w:date="2025-06-13T11:38:00Z">
+        <w:r>
+          <w:rPr>
+            <w:rFonts w:ascii="Arial" w:hAnsi="Arial" w:cs="Arial"/>
+            <w:rPrChange w:id="64" w:author="PeepT ㅤ" w:date="2025-06-13T11:38:00Z">
               <w:rPr/>
             </w:rPrChange>
           </w:rPr>
@@ -1219,155 +1373,6 @@
             <w:rFonts w:ascii="Arial" w:hAnsi="Arial" w:cs="Arial"/>
           </w:rPr>
           <w:t>e</w:t>
-        </w:r>
-        <w:r>
-          <w:rPr>
-            <w:rFonts w:ascii="Arial" w:hAnsi="Arial" w:cs="Arial"/>
-            <w:rPrChange w:id="50" w:author="PeepT ㅤ" w:date="2025-06-13T11:38:00Z">
-              <w:rPr/>
-            </w:rPrChange>
-          </w:rPr>
-          <w:t xml:space="preserve">stão centralizada de </w:t>
-        </w:r>
-        <w:r>
-          <w:rPr>
-            <w:rStyle w:val="Forte"/>
-            <w:rFonts w:ascii="Arial" w:hAnsi="Arial" w:cs="Arial"/>
-            <w:b w:val="0"/>
-            <w:bCs w:val="0"/>
-            <w:rPrChange w:id="51" w:author="PeepT ㅤ" w:date="2025-06-13T11:38:00Z">
-              <w:rPr>
-                <w:rStyle w:val="Forte"/>
-              </w:rPr>
-            </w:rPrChange>
-          </w:rPr>
-          <w:t>vistorias técnicas</w:t>
-        </w:r>
-      </w:ins>
-      <w:ins w:id="52" w:author="PeepT ㅤ" w:date="2025-06-13T11:39:00Z">
-        <w:r>
-          <w:rPr>
-            <w:rFonts w:ascii="Arial" w:hAnsi="Arial" w:cs="Arial"/>
-          </w:rPr>
-          <w:t>;</w:t>
-        </w:r>
-        <w:r>
-          <w:rPr>
-            <w:rFonts w:ascii="Arial" w:hAnsi="Arial" w:cs="Arial"/>
-          </w:rPr>
-          <w:br/>
-        </w:r>
-      </w:ins>
-      <w:ins w:id="53" w:author="PeepT ㅤ" w:date="2025-06-13T11:38:00Z">
-        <w:r>
-          <w:rPr>
-            <w:rFonts w:ascii="Arial" w:hAnsi="Arial" w:cs="Arial"/>
-            <w:rPrChange w:id="54" w:author="PeepT ㅤ" w:date="2025-06-13T11:38:00Z">
-              <w:rPr/>
-            </w:rPrChange>
-          </w:rPr>
-          <w:t xml:space="preserve">Controle e histórico de </w:t>
-        </w:r>
-        <w:r>
-          <w:rPr>
-            <w:rStyle w:val="Forte"/>
-            <w:rFonts w:ascii="Arial" w:hAnsi="Arial" w:cs="Arial"/>
-            <w:b w:val="0"/>
-            <w:bCs w:val="0"/>
-            <w:rPrChange w:id="55" w:author="PeepT ㅤ" w:date="2025-06-13T11:38:00Z">
-              <w:rPr>
-                <w:rStyle w:val="Forte"/>
-              </w:rPr>
-            </w:rPrChange>
-          </w:rPr>
-          <w:t>entregas de imóveis aos compradores</w:t>
-        </w:r>
-      </w:ins>
-      <w:ins w:id="56" w:author="PeepT ㅤ" w:date="2025-06-13T11:39:00Z">
-        <w:r>
-          <w:rPr>
-            <w:rFonts w:ascii="Arial" w:hAnsi="Arial" w:cs="Arial"/>
-          </w:rPr>
-          <w:t>;</w:t>
-        </w:r>
-        <w:r>
-          <w:rPr>
-            <w:rFonts w:ascii="Arial" w:hAnsi="Arial" w:cs="Arial"/>
-          </w:rPr>
-          <w:br/>
-        </w:r>
-      </w:ins>
-      <w:ins w:id="57" w:author="PeepT ㅤ" w:date="2025-06-13T11:38:00Z">
-        <w:r>
-          <w:rPr>
-            <w:rFonts w:ascii="Arial" w:hAnsi="Arial" w:cs="Arial"/>
-            <w:rPrChange w:id="58" w:author="PeepT ㅤ" w:date="2025-06-13T11:38:00Z">
-              <w:rPr/>
-            </w:rPrChange>
-          </w:rPr>
-          <w:t xml:space="preserve">Geração e armazenamento de </w:t>
-        </w:r>
-        <w:r>
-          <w:rPr>
-            <w:rStyle w:val="Forte"/>
-            <w:rFonts w:ascii="Arial" w:hAnsi="Arial" w:cs="Arial"/>
-            <w:b w:val="0"/>
-            <w:bCs w:val="0"/>
-            <w:rPrChange w:id="59" w:author="PeepT ㅤ" w:date="2025-06-13T11:38:00Z">
-              <w:rPr>
-                <w:rStyle w:val="Forte"/>
-              </w:rPr>
-            </w:rPrChange>
-          </w:rPr>
-          <w:t>relatórios técnicos</w:t>
-        </w:r>
-        <w:r>
-          <w:rPr>
-            <w:rFonts w:ascii="Arial" w:hAnsi="Arial" w:cs="Arial"/>
-            <w:rPrChange w:id="60" w:author="PeepT ㅤ" w:date="2025-06-13T11:38:00Z">
-              <w:rPr/>
-            </w:rPrChange>
-          </w:rPr>
-          <w:t>, com dados auditáveis</w:t>
-        </w:r>
-      </w:ins>
-      <w:ins w:id="61" w:author="PeepT ㅤ" w:date="2025-06-13T11:39:00Z">
-        <w:r>
-          <w:rPr>
-            <w:rFonts w:ascii="Arial" w:hAnsi="Arial" w:cs="Arial"/>
-          </w:rPr>
-          <w:t>;</w:t>
-        </w:r>
-        <w:r>
-          <w:rPr>
-            <w:rFonts w:ascii="Arial" w:hAnsi="Arial" w:cs="Arial"/>
-          </w:rPr>
-          <w:br/>
-        </w:r>
-      </w:ins>
-      <w:ins w:id="62" w:author="PeepT ㅤ" w:date="2025-06-13T11:38:00Z">
-        <w:r>
-          <w:rPr>
-            <w:rFonts w:ascii="Arial" w:hAnsi="Arial" w:cs="Arial"/>
-            <w:rPrChange w:id="63" w:author="PeepT ㅤ" w:date="2025-06-13T11:38:00Z">
-              <w:rPr/>
-            </w:rPrChange>
-          </w:rPr>
-          <w:t xml:space="preserve">Facilitação de </w:t>
-        </w:r>
-        <w:r>
-          <w:rPr>
-            <w:rStyle w:val="Forte"/>
-            <w:rFonts w:ascii="Arial" w:hAnsi="Arial" w:cs="Arial"/>
-            <w:b w:val="0"/>
-            <w:bCs w:val="0"/>
-            <w:rPrChange w:id="64" w:author="PeepT ㅤ" w:date="2025-06-13T11:38:00Z">
-              <w:rPr>
-                <w:rStyle w:val="Forte"/>
-              </w:rPr>
-            </w:rPrChange>
-          </w:rPr>
-          <w:t>acompanhamento do status da vistoria</w:t>
         </w:r>
         <w:r>
           <w:rPr>
@@ -1376,10 +1381,24 @@
               <w:rPr/>
             </w:rPrChange>
           </w:rPr>
-          <w:t xml:space="preserve"> pelo cliente</w:t>
+          <w:t xml:space="preserve">stão centralizada de </w:t>
+        </w:r>
+        <w:r>
+          <w:rPr>
+            <w:rStyle w:val="Forte"/>
+            <w:rFonts w:ascii="Arial" w:hAnsi="Arial" w:cs="Arial"/>
+            <w:b w:val="0"/>
+            <w:bCs w:val="0"/>
+            <w:rPrChange w:id="66" w:author="PeepT ㅤ" w:date="2025-06-13T11:38:00Z">
+              <w:rPr>
+                <w:rStyle w:val="Forte"/>
+              </w:rPr>
+            </w:rPrChange>
+          </w:rPr>
+          <w:t>vistorias técnicas</w:t>
         </w:r>
       </w:ins>
-      <w:ins w:id="66" w:author="PeepT ㅤ" w:date="2025-06-13T11:39:00Z">
+      <w:ins w:id="67" w:author="PeepT ㅤ" w:date="2025-06-13T11:39:00Z">
         <w:r>
           <w:rPr>
             <w:rFonts w:ascii="Arial" w:hAnsi="Arial" w:cs="Arial"/>
@@ -1393,15 +1412,15 @@
           <w:br/>
         </w:r>
       </w:ins>
-      <w:ins w:id="67" w:author="PeepT ㅤ" w:date="2025-06-13T11:38:00Z">
-        <w:r>
-          <w:rPr>
-            <w:rFonts w:ascii="Arial" w:hAnsi="Arial" w:cs="Arial"/>
-            <w:rPrChange w:id="68" w:author="PeepT ㅤ" w:date="2025-06-13T11:38:00Z">
+      <w:ins w:id="68" w:author="PeepT ㅤ" w:date="2025-06-13T11:38:00Z">
+        <w:r>
+          <w:rPr>
+            <w:rFonts w:ascii="Arial" w:hAnsi="Arial" w:cs="Arial"/>
+            <w:rPrChange w:id="69" w:author="PeepT ㅤ" w:date="2025-06-13T11:38:00Z">
               <w:rPr/>
             </w:rPrChange>
           </w:rPr>
-          <w:t xml:space="preserve">Integração com fluxos de </w:t>
+          <w:t xml:space="preserve">Controle e histórico de </w:t>
         </w:r>
         <w:r>
           <w:rPr>
@@ -1409,25 +1428,160 @@
             <w:rFonts w:ascii="Arial" w:hAnsi="Arial" w:cs="Arial"/>
             <w:b w:val="0"/>
             <w:bCs w:val="0"/>
-            <w:rPrChange w:id="69" w:author="PeepT ㅤ" w:date="2025-06-13T11:38:00Z">
+            <w:rPrChange w:id="70" w:author="PeepT ㅤ" w:date="2025-06-13T11:38:00Z">
               <w:rPr>
                 <w:rStyle w:val="Forte"/>
               </w:rPr>
             </w:rPrChange>
           </w:rPr>
-          <w:t>assinatura digital</w:t>
-        </w:r>
-        <w:r>
-          <w:rPr>
-            <w:rFonts w:ascii="Arial" w:hAnsi="Arial" w:cs="Arial"/>
-            <w:rPrChange w:id="70" w:author="PeepT ㅤ" w:date="2025-06-13T11:38:00Z">
+          <w:t>entregas de imóveis aos compradores</w:t>
+        </w:r>
+      </w:ins>
+      <w:ins w:id="71" w:author="PeepT ㅤ" w:date="2025-06-13T11:39:00Z">
+        <w:r>
+          <w:rPr>
+            <w:rFonts w:ascii="Arial" w:hAnsi="Arial" w:cs="Arial"/>
+          </w:rPr>
+          <w:t>;</w:t>
+        </w:r>
+        <w:r>
+          <w:rPr>
+            <w:rFonts w:ascii="Arial" w:hAnsi="Arial" w:cs="Arial"/>
+          </w:rPr>
+          <w:br/>
+        </w:r>
+      </w:ins>
+      <w:ins w:id="72" w:author="PeepT ㅤ" w:date="2025-06-13T11:38:00Z">
+        <w:r>
+          <w:rPr>
+            <w:rFonts w:ascii="Arial" w:hAnsi="Arial" w:cs="Arial"/>
+            <w:rPrChange w:id="73" w:author="PeepT ㅤ" w:date="2025-06-13T11:38:00Z">
               <w:rPr/>
             </w:rPrChange>
           </w:rPr>
+          <w:t xml:space="preserve">Geração e armazenamento de </w:t>
+        </w:r>
+        <w:r>
+          <w:rPr>
+            <w:rStyle w:val="Forte"/>
+            <w:rFonts w:ascii="Arial" w:hAnsi="Arial" w:cs="Arial"/>
+            <w:b w:val="0"/>
+            <w:bCs w:val="0"/>
+            <w:rPrChange w:id="74" w:author="PeepT ㅤ" w:date="2025-06-13T11:38:00Z">
+              <w:rPr>
+                <w:rStyle w:val="Forte"/>
+              </w:rPr>
+            </w:rPrChange>
+          </w:rPr>
+          <w:t>relatórios técnicos</w:t>
+        </w:r>
+        <w:r>
+          <w:rPr>
+            <w:rFonts w:ascii="Arial" w:hAnsi="Arial" w:cs="Arial"/>
+            <w:rPrChange w:id="75" w:author="PeepT ㅤ" w:date="2025-06-13T11:38:00Z">
+              <w:rPr/>
+            </w:rPrChange>
+          </w:rPr>
+          <w:t>, com dados auditáveis</w:t>
+        </w:r>
+      </w:ins>
+      <w:ins w:id="76" w:author="PeepT ㅤ" w:date="2025-06-13T11:39:00Z">
+        <w:r>
+          <w:rPr>
+            <w:rFonts w:ascii="Arial" w:hAnsi="Arial" w:cs="Arial"/>
+          </w:rPr>
+          <w:t>;</w:t>
+        </w:r>
+        <w:r>
+          <w:rPr>
+            <w:rFonts w:ascii="Arial" w:hAnsi="Arial" w:cs="Arial"/>
+          </w:rPr>
+          <w:br/>
+        </w:r>
+      </w:ins>
+      <w:ins w:id="77" w:author="PeepT ㅤ" w:date="2025-06-13T11:38:00Z">
+        <w:r>
+          <w:rPr>
+            <w:rFonts w:ascii="Arial" w:hAnsi="Arial" w:cs="Arial"/>
+            <w:rPrChange w:id="78" w:author="PeepT ㅤ" w:date="2025-06-13T11:38:00Z">
+              <w:rPr/>
+            </w:rPrChange>
+          </w:rPr>
+          <w:t xml:space="preserve">Facilitação de </w:t>
+        </w:r>
+        <w:r>
+          <w:rPr>
+            <w:rStyle w:val="Forte"/>
+            <w:rFonts w:ascii="Arial" w:hAnsi="Arial" w:cs="Arial"/>
+            <w:b w:val="0"/>
+            <w:bCs w:val="0"/>
+            <w:rPrChange w:id="79" w:author="PeepT ㅤ" w:date="2025-06-13T11:38:00Z">
+              <w:rPr>
+                <w:rStyle w:val="Forte"/>
+              </w:rPr>
+            </w:rPrChange>
+          </w:rPr>
+          <w:t>acompanhamento do status da vistoria</w:t>
+        </w:r>
+        <w:r>
+          <w:rPr>
+            <w:rFonts w:ascii="Arial" w:hAnsi="Arial" w:cs="Arial"/>
+            <w:rPrChange w:id="80" w:author="PeepT ㅤ" w:date="2025-06-13T11:38:00Z">
+              <w:rPr/>
+            </w:rPrChange>
+          </w:rPr>
+          <w:t xml:space="preserve"> pelo cliente</w:t>
+        </w:r>
+      </w:ins>
+      <w:ins w:id="81" w:author="PeepT ㅤ" w:date="2025-06-13T11:39:00Z">
+        <w:r>
+          <w:rPr>
+            <w:rFonts w:ascii="Arial" w:hAnsi="Arial" w:cs="Arial"/>
+          </w:rPr>
+          <w:t>;</w:t>
+        </w:r>
+        <w:r>
+          <w:rPr>
+            <w:rFonts w:ascii="Arial" w:hAnsi="Arial" w:cs="Arial"/>
+          </w:rPr>
+          <w:br/>
+        </w:r>
+      </w:ins>
+      <w:ins w:id="82" w:author="PeepT ㅤ" w:date="2025-06-13T11:38:00Z">
+        <w:r>
+          <w:rPr>
+            <w:rFonts w:ascii="Arial" w:hAnsi="Arial" w:cs="Arial"/>
+            <w:rPrChange w:id="83" w:author="PeepT ㅤ" w:date="2025-06-13T11:38:00Z">
+              <w:rPr/>
+            </w:rPrChange>
+          </w:rPr>
+          <w:t xml:space="preserve">Integração com fluxos de </w:t>
+        </w:r>
+        <w:r>
+          <w:rPr>
+            <w:rStyle w:val="Forte"/>
+            <w:rFonts w:ascii="Arial" w:hAnsi="Arial" w:cs="Arial"/>
+            <w:b w:val="0"/>
+            <w:bCs w:val="0"/>
+            <w:rPrChange w:id="84" w:author="PeepT ㅤ" w:date="2025-06-13T11:38:00Z">
+              <w:rPr>
+                <w:rStyle w:val="Forte"/>
+              </w:rPr>
+            </w:rPrChange>
+          </w:rPr>
+          <w:t>assinatura digital</w:t>
+        </w:r>
+        <w:r>
+          <w:rPr>
+            <w:rFonts w:ascii="Arial" w:hAnsi="Arial" w:cs="Arial"/>
+            <w:rPrChange w:id="85" w:author="PeepT ㅤ" w:date="2025-06-13T11:38:00Z">
+              <w:rPr/>
+            </w:rPrChange>
+          </w:rPr>
           <w:t>, anexos e comunicação com os responsáveis.</w:t>
         </w:r>
       </w:ins>
-      <w:del w:id="71" w:author="PeepT ㅤ" w:date="2025-06-13T11:38:00Z">
+      <w:del w:id="86" w:author="PeepT ㅤ" w:date="2025-06-13T11:38:00Z">
         <w:r>
           <w:rPr>
             <w:rFonts w:ascii="Arial" w:hAnsi="Arial" w:cs="Arial"/>
@@ -1444,7 +1598,7 @@
         <w:ind w:firstLine="709"/>
         <w:jc w:val="both"/>
         <w:rPr>
-          <w:ins w:id="72" w:author="BRUNO KAUAN RODRIGUES SILVA" w:date="2025-06-13T18:06:00Z" w16du:dateUtc="2025-06-13T21:06:00Z"/>
+          <w:ins w:id="87" w:author="BRUNO KAUAN RODRIGUES SILVA" w:date="2025-06-13T18:06:00Z" w16du:dateUtc="2025-06-13T21:06:00Z"/>
           <w:rFonts w:ascii="Arial" w:hAnsi="Arial" w:cs="Arial"/>
         </w:rPr>
       </w:pPr>
@@ -1456,7 +1610,7 @@
         <w:ind w:firstLine="709"/>
         <w:jc w:val="both"/>
         <w:rPr>
-          <w:ins w:id="73" w:author="BRUNO KAUAN RODRIGUES SILVA" w:date="2025-06-13T18:07:00Z" w16du:dateUtc="2025-06-13T21:07:00Z"/>
+          <w:ins w:id="88" w:author="BRUNO KAUAN RODRIGUES SILVA" w:date="2025-06-13T18:07:00Z" w16du:dateUtc="2025-06-13T21:07:00Z"/>
           <w:rFonts w:ascii="Arial" w:hAnsi="Arial" w:cs="Arial"/>
         </w:rPr>
       </w:pPr>
@@ -1468,11 +1622,11 @@
         <w:ind w:firstLine="709"/>
         <w:jc w:val="both"/>
         <w:rPr>
-          <w:ins w:id="74" w:author="BRUNO KAUAN RODRIGUES SILVA" w:date="2025-06-13T18:06:00Z" w16du:dateUtc="2025-06-13T21:06:00Z"/>
-          <w:rFonts w:ascii="Arial" w:hAnsi="Arial" w:cs="Arial"/>
-          <w:rPrChange w:id="75" w:author="PeepT ㅤ" w:date="2025-06-13T11:39:00Z">
+          <w:ins w:id="89" w:author="BRUNO KAUAN RODRIGUES SILVA" w:date="2025-06-13T18:06:00Z" w16du:dateUtc="2025-06-13T21:06:00Z"/>
+          <w:rFonts w:ascii="Arial" w:hAnsi="Arial" w:cs="Arial"/>
+          <w:rPrChange w:id="90" w:author="PeepT ㅤ" w:date="2025-06-13T11:39:00Z">
             <w:rPr>
-              <w:ins w:id="76" w:author="BRUNO KAUAN RODRIGUES SILVA" w:date="2025-06-13T18:06:00Z" w16du:dateUtc="2025-06-13T21:06:00Z"/>
+              <w:ins w:id="91" w:author="BRUNO KAUAN RODRIGUES SILVA" w:date="2025-06-13T18:06:00Z" w16du:dateUtc="2025-06-13T21:06:00Z"/>
               <w:i/>
               <w:iCs/>
               <w:color w:val="7F7F7F" w:themeColor="text1" w:themeTint="80"/>
@@ -1480,7 +1634,7 @@
             </w:rPr>
           </w:rPrChange>
         </w:rPr>
-        <w:pPrChange w:id="77" w:author="BRUNO KAUAN RODRIGUES SILVA" w:date="2025-06-13T18:05:00Z" w16du:dateUtc="2025-06-13T21:05:00Z">
+        <w:pPrChange w:id="92" w:author="BRUNO KAUAN RODRIGUES SILVA" w:date="2025-06-13T18:05:00Z" w16du:dateUtc="2025-06-13T21:05:00Z">
           <w:pPr>
             <w:spacing w:line="360" w:lineRule="auto"/>
           </w:pPr>
@@ -1499,7 +1653,7 @@
           <w:iCs/>
           <w:color w:val="7F7F7F" w:themeColor="text1" w:themeTint="80"/>
         </w:rPr>
-        <w:pPrChange w:id="78" w:author="BRUNO KAUAN RODRIGUES SILVA" w:date="2025-06-13T18:05:00Z" w16du:dateUtc="2025-06-13T21:05:00Z">
+        <w:pPrChange w:id="93" w:author="BRUNO KAUAN RODRIGUES SILVA" w:date="2025-06-13T18:05:00Z" w16du:dateUtc="2025-06-13T21:05:00Z">
           <w:pPr>
             <w:spacing w:before="119" w:line="360" w:lineRule="auto"/>
             <w:ind w:left="396" w:right="295"/>
@@ -1511,7 +1665,7 @@
       <w:pPr>
         <w:spacing w:line="360" w:lineRule="auto"/>
         <w:rPr>
-          <w:del w:id="79" w:author="PeepT ㅤ" w:date="2025-06-13T11:41:00Z"/>
+          <w:del w:id="94" w:author="PeepT ㅤ" w:date="2025-06-13T11:41:00Z"/>
           <w:rFonts w:ascii="Arial" w:hAnsi="Arial" w:cs="Arial"/>
         </w:rPr>
       </w:pPr>
@@ -1529,7 +1683,7 @@
       <w:pPr>
         <w:spacing w:line="360" w:lineRule="auto"/>
         <w:rPr>
-          <w:ins w:id="80" w:author="PeepT ㅤ" w:date="2025-06-13T11:41:00Z"/>
+          <w:ins w:id="95" w:author="PeepT ㅤ" w:date="2025-06-13T11:41:00Z"/>
           <w:rFonts w:ascii="Arial" w:hAnsi="Arial" w:cs="Arial"/>
           <w:b/>
           <w:bCs/>
@@ -1540,25 +1694,25 @@
       <w:pPr>
         <w:spacing w:line="360" w:lineRule="auto"/>
         <w:rPr>
-          <w:ins w:id="81" w:author="PeepT ㅤ" w:date="2025-06-13T11:41:00Z"/>
-          <w:rFonts w:ascii="Arial" w:hAnsi="Arial" w:cs="Arial"/>
-          <w:rPrChange w:id="82" w:author="PeepT ㅤ" w:date="2025-06-13T11:41:00Z">
+          <w:ins w:id="96" w:author="PeepT ㅤ" w:date="2025-06-13T11:41:00Z"/>
+          <w:rFonts w:ascii="Arial" w:hAnsi="Arial" w:cs="Arial"/>
+          <w:rPrChange w:id="97" w:author="PeepT ㅤ" w:date="2025-06-13T11:41:00Z">
             <w:rPr>
-              <w:ins w:id="83" w:author="PeepT ㅤ" w:date="2025-06-13T11:41:00Z"/>
+              <w:ins w:id="98" w:author="PeepT ㅤ" w:date="2025-06-13T11:41:00Z"/>
             </w:rPr>
           </w:rPrChange>
         </w:rPr>
-        <w:pPrChange w:id="84" w:author="PeepT ㅤ" w:date="2025-06-13T11:41:00Z">
+        <w:pPrChange w:id="99" w:author="PeepT ㅤ" w:date="2025-06-13T11:41:00Z">
           <w:pPr>
             <w:spacing w:before="100" w:beforeAutospacing="1" w:after="100" w:afterAutospacing="1"/>
           </w:pPr>
         </w:pPrChange>
       </w:pPr>
-      <w:ins w:id="85" w:author="PeepT ㅤ" w:date="2025-06-13T11:41:00Z">
-        <w:r>
-          <w:rPr>
-            <w:rFonts w:ascii="Arial" w:hAnsi="Arial" w:cs="Arial"/>
-            <w:rPrChange w:id="86" w:author="PeepT ㅤ" w:date="2025-06-13T11:41:00Z">
+      <w:ins w:id="100" w:author="PeepT ㅤ" w:date="2025-06-13T11:41:00Z">
+        <w:r>
+          <w:rPr>
+            <w:rFonts w:ascii="Arial" w:hAnsi="Arial" w:cs="Arial"/>
+            <w:rPrChange w:id="101" w:author="PeepT ㅤ" w:date="2025-06-13T11:41:00Z">
               <w:rPr/>
             </w:rPrChange>
           </w:rPr>
@@ -1567,7 +1721,7 @@
         <w:r>
           <w:rPr>
             <w:rFonts w:ascii="Arial" w:hAnsi="Arial" w:cs="Arial"/>
-            <w:rPrChange w:id="87" w:author="PeepT ㅤ" w:date="2025-06-13T11:41:00Z">
+            <w:rPrChange w:id="102" w:author="PeepT ㅤ" w:date="2025-06-13T11:41:00Z">
               <w:rPr>
                 <w:b/>
                 <w:bCs/>
@@ -1579,7 +1733,7 @@
         <w:r>
           <w:rPr>
             <w:rFonts w:ascii="Arial" w:hAnsi="Arial" w:cs="Arial"/>
-            <w:rPrChange w:id="88" w:author="PeepT ㅤ" w:date="2025-06-13T11:41:00Z">
+            <w:rPrChange w:id="103" w:author="PeepT ㅤ" w:date="2025-06-13T11:41:00Z">
               <w:rPr/>
             </w:rPrChange>
           </w:rPr>
@@ -1589,7 +1743,7 @@
         <w:r>
           <w:rPr>
             <w:rFonts w:ascii="Arial" w:hAnsi="Arial" w:cs="Arial"/>
-            <w:rPrChange w:id="89" w:author="PeepT ㅤ" w:date="2025-06-13T11:41:00Z">
+            <w:rPrChange w:id="104" w:author="PeepT ㅤ" w:date="2025-06-13T11:41:00Z">
               <w:rPr/>
             </w:rPrChange>
           </w:rPr>
@@ -1599,7 +1753,7 @@
         <w:r>
           <w:rPr>
             <w:rFonts w:ascii="Arial" w:hAnsi="Arial" w:cs="Arial"/>
-            <w:rPrChange w:id="90" w:author="PeepT ㅤ" w:date="2025-06-13T11:41:00Z">
+            <w:rPrChange w:id="105" w:author="PeepT ㅤ" w:date="2025-06-13T11:41:00Z">
               <w:rPr/>
             </w:rPrChange>
           </w:rPr>
@@ -1609,7 +1763,7 @@
         <w:r>
           <w:rPr>
             <w:rFonts w:ascii="Arial" w:hAnsi="Arial" w:cs="Arial"/>
-            <w:rPrChange w:id="91" w:author="PeepT ㅤ" w:date="2025-06-13T11:41:00Z">
+            <w:rPrChange w:id="106" w:author="PeepT ㅤ" w:date="2025-06-13T11:41:00Z">
               <w:rPr/>
             </w:rPrChange>
           </w:rPr>
@@ -1619,14 +1773,14 @@
         <w:r>
           <w:rPr>
             <w:rFonts w:ascii="Arial" w:hAnsi="Arial" w:cs="Arial"/>
-            <w:rPrChange w:id="92" w:author="PeepT ㅤ" w:date="2025-06-13T11:41:00Z">
+            <w:rPrChange w:id="107" w:author="PeepT ㅤ" w:date="2025-06-13T11:41:00Z">
               <w:rPr/>
             </w:rPrChange>
           </w:rPr>
           <w:t>, Gov.br)</w:t>
         </w:r>
       </w:ins>
-      <w:ins w:id="93" w:author="PeepT ㅤ" w:date="2025-06-13T11:42:00Z">
+      <w:ins w:id="108" w:author="PeepT ㅤ" w:date="2025-06-13T11:42:00Z">
         <w:r>
           <w:rPr>
             <w:rFonts w:ascii="Arial" w:hAnsi="Arial" w:cs="Arial"/>
@@ -1634,7 +1788,7 @@
           <w:t>;</w:t>
         </w:r>
       </w:ins>
-      <w:ins w:id="94" w:author="PeepT ㅤ" w:date="2025-06-13T11:41:00Z">
+      <w:ins w:id="109" w:author="PeepT ㅤ" w:date="2025-06-13T11:41:00Z">
         <w:r>
           <w:rPr>
             <w:rFonts w:ascii="Arial" w:hAnsi="Arial" w:cs="Arial"/>
@@ -1644,7 +1798,7 @@
         <w:r>
           <w:rPr>
             <w:rFonts w:ascii="Arial" w:hAnsi="Arial" w:cs="Arial"/>
-            <w:rPrChange w:id="95" w:author="PeepT ㅤ" w:date="2025-06-13T11:41:00Z">
+            <w:rPrChange w:id="110" w:author="PeepT ㅤ" w:date="2025-06-13T11:41:00Z">
               <w:rPr/>
             </w:rPrChange>
           </w:rPr>
@@ -1653,7 +1807,7 @@
         <w:r>
           <w:rPr>
             <w:rFonts w:ascii="Arial" w:hAnsi="Arial" w:cs="Arial"/>
-            <w:rPrChange w:id="96" w:author="PeepT ㅤ" w:date="2025-06-13T11:41:00Z">
+            <w:rPrChange w:id="111" w:author="PeepT ㅤ" w:date="2025-06-13T11:41:00Z">
               <w:rPr>
                 <w:b/>
                 <w:bCs/>
@@ -1665,7 +1819,7 @@
         <w:r>
           <w:rPr>
             <w:rFonts w:ascii="Arial" w:hAnsi="Arial" w:cs="Arial"/>
-            <w:rPrChange w:id="97" w:author="PeepT ㅤ" w:date="2025-06-13T11:41:00Z">
+            <w:rPrChange w:id="112" w:author="PeepT ㅤ" w:date="2025-06-13T11:41:00Z">
               <w:rPr/>
             </w:rPrChange>
           </w:rPr>
@@ -1677,12 +1831,12 @@
       <w:pPr>
         <w:spacing w:line="360" w:lineRule="auto"/>
         <w:rPr>
-          <w:del w:id="98" w:author="PeepT ㅤ" w:date="2025-06-13T11:41:00Z"/>
+          <w:del w:id="113" w:author="PeepT ㅤ" w:date="2025-06-13T11:41:00Z"/>
           <w:rFonts w:ascii="Arial" w:hAnsi="Arial" w:cs="Arial"/>
           <w:color w:val="808080" w:themeColor="background1" w:themeShade="80"/>
         </w:rPr>
       </w:pPr>
-      <w:del w:id="99" w:author="PeepT ㅤ" w:date="2025-06-13T11:41:00Z">
+      <w:del w:id="114" w:author="PeepT ㅤ" w:date="2025-06-13T11:41:00Z">
         <w:r>
           <w:rPr>
             <w:rFonts w:ascii="Arial" w:hAnsi="Arial" w:cs="Arial"/>
@@ -1724,15 +1878,15 @@
         <w:spacing w:line="360" w:lineRule="auto"/>
         <w:jc w:val="both"/>
         <w:rPr>
-          <w:del w:id="100" w:author="PeepT ㅤ" w:date="2025-06-13T11:42:00Z"/>
-          <w:rFonts w:ascii="Arial" w:hAnsi="Arial" w:cs="Arial"/>
-        </w:rPr>
-      </w:pPr>
-      <w:ins w:id="101" w:author="PeepT ㅤ" w:date="2025-06-13T11:42:00Z">
-        <w:r>
-          <w:rPr>
-            <w:rFonts w:ascii="Arial" w:hAnsi="Arial" w:cs="Arial"/>
-            <w:rPrChange w:id="102" w:author="PeepT ㅤ" w:date="2025-06-13T11:42:00Z">
+          <w:del w:id="115" w:author="PeepT ㅤ" w:date="2025-06-13T11:42:00Z"/>
+          <w:rFonts w:ascii="Arial" w:hAnsi="Arial" w:cs="Arial"/>
+        </w:rPr>
+      </w:pPr>
+      <w:ins w:id="116" w:author="PeepT ㅤ" w:date="2025-06-13T11:42:00Z">
+        <w:r>
+          <w:rPr>
+            <w:rFonts w:ascii="Arial" w:hAnsi="Arial" w:cs="Arial"/>
+            <w:rPrChange w:id="117" w:author="PeepT ㅤ" w:date="2025-06-13T11:42:00Z">
               <w:rPr/>
             </w:rPrChange>
           </w:rPr>
@@ -1744,7 +1898,7 @@
             <w:rFonts w:ascii="Arial" w:hAnsi="Arial" w:cs="Arial"/>
             <w:b w:val="0"/>
             <w:bCs w:val="0"/>
-            <w:rPrChange w:id="103" w:author="PeepT ㅤ" w:date="2025-06-13T11:42:00Z">
+            <w:rPrChange w:id="118" w:author="PeepT ㅤ" w:date="2025-06-13T11:42:00Z">
               <w:rPr>
                 <w:rStyle w:val="Forte"/>
               </w:rPr>
@@ -1755,7 +1909,7 @@
         <w:r>
           <w:rPr>
             <w:rFonts w:ascii="Arial" w:hAnsi="Arial" w:cs="Arial"/>
-            <w:rPrChange w:id="104" w:author="PeepT ㅤ" w:date="2025-06-13T11:42:00Z">
+            <w:rPrChange w:id="119" w:author="PeepT ㅤ" w:date="2025-06-13T11:42:00Z">
               <w:rPr/>
             </w:rPrChange>
           </w:rPr>
@@ -1767,7 +1921,7 @@
             <w:rFonts w:ascii="Arial" w:hAnsi="Arial" w:cs="Arial"/>
             <w:b w:val="0"/>
             <w:bCs w:val="0"/>
-            <w:rPrChange w:id="105" w:author="PeepT ㅤ" w:date="2025-06-13T11:42:00Z">
+            <w:rPrChange w:id="120" w:author="PeepT ㅤ" w:date="2025-06-13T11:42:00Z">
               <w:rPr>
                 <w:rStyle w:val="Forte"/>
               </w:rPr>
@@ -1778,14 +1932,14 @@
         <w:r>
           <w:rPr>
             <w:rFonts w:ascii="Arial" w:hAnsi="Arial" w:cs="Arial"/>
-            <w:rPrChange w:id="106" w:author="PeepT ㅤ" w:date="2025-06-13T11:42:00Z">
+            <w:rPrChange w:id="121" w:author="PeepT ㅤ" w:date="2025-06-13T11:42:00Z">
               <w:rPr/>
             </w:rPrChange>
           </w:rPr>
           <w:t>.</w:t>
         </w:r>
       </w:ins>
-      <w:del w:id="107" w:author="PeepT ㅤ" w:date="2025-06-13T11:42:00Z">
+      <w:del w:id="122" w:author="PeepT ㅤ" w:date="2025-06-13T11:42:00Z">
         <w:r>
           <w:rPr>
             <w:rFonts w:ascii="Arial" w:hAnsi="Arial" w:cs="Arial"/>
@@ -1800,7 +1954,7 @@
         <w:spacing w:line="360" w:lineRule="auto"/>
         <w:jc w:val="both"/>
         <w:rPr>
-          <w:ins w:id="108" w:author="PeepT ㅤ" w:date="2025-06-13T12:00:00Z"/>
+          <w:ins w:id="123" w:author="PeepT ㅤ" w:date="2025-06-13T12:00:00Z"/>
           <w:rFonts w:ascii="Arial" w:hAnsi="Arial" w:cs="Arial"/>
         </w:rPr>
       </w:pPr>
@@ -1810,7 +1964,7 @@
         <w:spacing w:line="360" w:lineRule="auto"/>
         <w:jc w:val="both"/>
         <w:rPr>
-          <w:ins w:id="109" w:author="PeepT ㅤ" w:date="2025-06-13T12:00:00Z"/>
+          <w:ins w:id="124" w:author="PeepT ㅤ" w:date="2025-06-13T12:00:00Z"/>
           <w:rFonts w:ascii="Arial" w:hAnsi="Arial" w:cs="Arial"/>
         </w:rPr>
       </w:pPr>
@@ -1820,7 +1974,7 @@
         <w:spacing w:line="360" w:lineRule="auto"/>
         <w:jc w:val="both"/>
         <w:rPr>
-          <w:ins w:id="110" w:author="PeepT ㅤ" w:date="2025-06-13T12:00:00Z"/>
+          <w:ins w:id="125" w:author="PeepT ㅤ" w:date="2025-06-13T12:00:00Z"/>
           <w:rFonts w:ascii="Arial" w:hAnsi="Arial" w:cs="Arial"/>
         </w:rPr>
       </w:pPr>
@@ -1830,7 +1984,7 @@
         <w:spacing w:line="360" w:lineRule="auto"/>
         <w:jc w:val="both"/>
         <w:rPr>
-          <w:ins w:id="111" w:author="PeepT ㅤ" w:date="2025-06-13T12:00:00Z"/>
+          <w:ins w:id="126" w:author="PeepT ㅤ" w:date="2025-06-13T12:00:00Z"/>
           <w:rFonts w:ascii="Arial" w:hAnsi="Arial" w:cs="Arial"/>
           <w:color w:val="808080" w:themeColor="background1" w:themeShade="80"/>
         </w:rPr>
@@ -1851,7 +2005,7 @@
         <w:spacing w:before="119" w:line="360" w:lineRule="auto"/>
         <w:ind w:right="295"/>
         <w:rPr>
-          <w:del w:id="112" w:author="PeepT ㅤ" w:date="2025-06-13T11:46:00Z"/>
+          <w:del w:id="127" w:author="PeepT ㅤ" w:date="2025-06-13T11:46:00Z"/>
           <w:rFonts w:ascii="Arial" w:hAnsi="Arial" w:cs="Arial"/>
         </w:rPr>
       </w:pPr>
@@ -1870,7 +2024,7 @@
         <w:spacing w:before="119" w:line="360" w:lineRule="auto"/>
         <w:ind w:right="295"/>
         <w:rPr>
-          <w:ins w:id="113" w:author="PeepT ㅤ" w:date="2025-06-13T11:46:00Z"/>
+          <w:ins w:id="128" w:author="PeepT ㅤ" w:date="2025-06-13T11:46:00Z"/>
           <w:rFonts w:ascii="Arial" w:hAnsi="Arial" w:cs="Arial"/>
           <w:b/>
           <w:bCs/>
@@ -1883,16 +2037,16 @@
         <w:spacing w:before="119" w:line="360" w:lineRule="auto"/>
         <w:ind w:right="295"/>
         <w:rPr>
-          <w:ins w:id="114" w:author="PeepT ㅤ" w:date="2025-06-13T12:00:00Z"/>
+          <w:ins w:id="129" w:author="PeepT ㅤ" w:date="2025-06-13T12:00:00Z"/>
           <w:rFonts w:ascii="Arial" w:hAnsi="Arial" w:cs="Arial"/>
         </w:rPr>
       </w:pPr>
       <w:proofErr w:type="spellStart"/>
-      <w:ins w:id="115" w:author="PeepT ㅤ" w:date="2025-06-13T11:46:00Z">
-        <w:r>
-          <w:rPr>
-            <w:rFonts w:ascii="Arial" w:hAnsi="Arial" w:cs="Arial"/>
-            <w:rPrChange w:id="116" w:author="PeepT ㅤ" w:date="2025-06-13T11:47:00Z">
+      <w:ins w:id="130" w:author="PeepT ㅤ" w:date="2025-06-13T11:46:00Z">
+        <w:r>
+          <w:rPr>
+            <w:rFonts w:ascii="Arial" w:hAnsi="Arial" w:cs="Arial"/>
+            <w:rPrChange w:id="131" w:author="PeepT ㅤ" w:date="2025-06-13T11:47:00Z">
               <w:rPr>
                 <w:b/>
                 <w:bCs/>
@@ -1903,7 +2057,7 @@
         </w:r>
       </w:ins>
       <w:proofErr w:type="spellEnd"/>
-      <w:ins w:id="117" w:author="PeepT ㅤ" w:date="2025-06-13T11:47:00Z">
+      <w:ins w:id="132" w:author="PeepT ㅤ" w:date="2025-06-13T11:47:00Z">
         <w:r>
           <w:rPr>
             <w:rFonts w:ascii="Arial" w:hAnsi="Arial" w:cs="Arial"/>
@@ -1911,11 +2065,11 @@
           <w:br/>
         </w:r>
       </w:ins>
-      <w:ins w:id="118" w:author="PeepT ㅤ" w:date="2025-06-13T11:46:00Z">
-        <w:r>
-          <w:rPr>
-            <w:rFonts w:ascii="Arial" w:hAnsi="Arial" w:cs="Arial"/>
-            <w:rPrChange w:id="119" w:author="PeepT ㅤ" w:date="2025-06-13T11:47:00Z">
+      <w:ins w:id="133" w:author="PeepT ㅤ" w:date="2025-06-13T11:46:00Z">
+        <w:r>
+          <w:rPr>
+            <w:rFonts w:ascii="Arial" w:hAnsi="Arial" w:cs="Arial"/>
+            <w:rPrChange w:id="134" w:author="PeepT ㅤ" w:date="2025-06-13T11:47:00Z">
               <w:rPr>
                 <w:b/>
                 <w:bCs/>
@@ -1931,15 +2085,15 @@
         <w:spacing w:before="119" w:line="276" w:lineRule="auto"/>
         <w:ind w:right="295"/>
         <w:rPr>
-          <w:ins w:id="120" w:author="PeepT ㅤ" w:date="2025-06-13T11:47:00Z"/>
-          <w:rFonts w:ascii="Arial" w:hAnsi="Arial" w:cs="Arial"/>
-          <w:rPrChange w:id="121" w:author="PeepT ㅤ" w:date="2025-06-13T11:48:00Z">
+          <w:ins w:id="135" w:author="PeepT ㅤ" w:date="2025-06-13T11:47:00Z"/>
+          <w:rFonts w:ascii="Arial" w:hAnsi="Arial" w:cs="Arial"/>
+          <w:rPrChange w:id="136" w:author="PeepT ㅤ" w:date="2025-06-13T11:48:00Z">
             <w:rPr>
-              <w:ins w:id="122" w:author="PeepT ㅤ" w:date="2025-06-13T11:47:00Z"/>
+              <w:ins w:id="137" w:author="PeepT ㅤ" w:date="2025-06-13T11:47:00Z"/>
             </w:rPr>
           </w:rPrChange>
         </w:rPr>
-        <w:pPrChange w:id="123" w:author="PeepT ㅤ" w:date="2025-06-13T12:01:00Z">
+        <w:pPrChange w:id="138" w:author="PeepT ㅤ" w:date="2025-06-13T12:01:00Z">
           <w:pPr>
             <w:pStyle w:val="NormalWeb"/>
             <w:numPr>
@@ -1952,18 +2106,18 @@
           </w:pPr>
         </w:pPrChange>
       </w:pPr>
-      <w:ins w:id="124" w:author="PeepT ㅤ" w:date="2025-06-13T11:47:00Z">
-        <w:r>
-          <w:rPr>
-            <w:rFonts w:ascii="Arial" w:hAnsi="Arial" w:cs="Arial"/>
-            <w:rPrChange w:id="125" w:author="PeepT ㅤ" w:date="2025-06-13T11:48:00Z">
+      <w:ins w:id="139" w:author="PeepT ㅤ" w:date="2025-06-13T11:47:00Z">
+        <w:r>
+          <w:rPr>
+            <w:rFonts w:ascii="Arial" w:hAnsi="Arial" w:cs="Arial"/>
+            <w:rPrChange w:id="140" w:author="PeepT ㅤ" w:date="2025-06-13T11:48:00Z">
               <w:rPr/>
             </w:rPrChange>
           </w:rPr>
           <w:t>Entretanto, o sistema proposto se diferencia por:</w:t>
         </w:r>
       </w:ins>
-      <w:ins w:id="126" w:author="PeepT ㅤ" w:date="2025-06-13T12:00:00Z">
+      <w:ins w:id="141" w:author="PeepT ㅤ" w:date="2025-06-13T12:00:00Z">
         <w:r>
           <w:rPr>
             <w:rFonts w:ascii="Arial" w:hAnsi="Arial" w:cs="Arial"/>
@@ -1972,18 +2126,18 @@
           <w:t xml:space="preserve">- </w:t>
         </w:r>
       </w:ins>
-      <w:ins w:id="127" w:author="PeepT ㅤ" w:date="2025-06-13T11:47:00Z">
-        <w:r>
-          <w:rPr>
-            <w:rFonts w:ascii="Arial" w:hAnsi="Arial" w:cs="Arial"/>
-            <w:rPrChange w:id="128" w:author="PeepT ㅤ" w:date="2025-06-13T11:48:00Z">
+      <w:ins w:id="142" w:author="PeepT ㅤ" w:date="2025-06-13T11:47:00Z">
+        <w:r>
+          <w:rPr>
+            <w:rFonts w:ascii="Arial" w:hAnsi="Arial" w:cs="Arial"/>
+            <w:rPrChange w:id="143" w:author="PeepT ㅤ" w:date="2025-06-13T11:48:00Z">
               <w:rPr/>
             </w:rPrChange>
           </w:rPr>
           <w:t>Permitir múltiplas vistorias por imóvel, com histórico completo</w:t>
         </w:r>
       </w:ins>
-      <w:ins w:id="129" w:author="PeepT ㅤ" w:date="2025-06-13T11:48:00Z">
+      <w:ins w:id="144" w:author="PeepT ㅤ" w:date="2025-06-13T11:48:00Z">
         <w:r>
           <w:rPr>
             <w:rFonts w:ascii="Arial" w:hAnsi="Arial" w:cs="Arial"/>
@@ -1997,7 +2151,7 @@
           <w:br/>
         </w:r>
       </w:ins>
-      <w:ins w:id="130" w:author="PeepT ㅤ" w:date="2025-06-13T12:00:00Z">
+      <w:ins w:id="145" w:author="PeepT ㅤ" w:date="2025-06-13T12:00:00Z">
         <w:r>
           <w:rPr>
             <w:rFonts w:ascii="Arial" w:hAnsi="Arial" w:cs="Arial"/>
@@ -2005,11 +2159,11 @@
           <w:t xml:space="preserve">- </w:t>
         </w:r>
       </w:ins>
-      <w:ins w:id="131" w:author="PeepT ㅤ" w:date="2025-06-13T11:47:00Z">
-        <w:r>
-          <w:rPr>
-            <w:rFonts w:ascii="Arial" w:hAnsi="Arial" w:cs="Arial"/>
-            <w:rPrChange w:id="132" w:author="PeepT ㅤ" w:date="2025-06-13T11:48:00Z">
+      <w:ins w:id="146" w:author="PeepT ㅤ" w:date="2025-06-13T11:47:00Z">
+        <w:r>
+          <w:rPr>
+            <w:rFonts w:ascii="Arial" w:hAnsi="Arial" w:cs="Arial"/>
+            <w:rPrChange w:id="147" w:author="PeepT ㅤ" w:date="2025-06-13T11:48:00Z">
               <w:rPr/>
             </w:rPrChange>
           </w:rPr>
@@ -2021,7 +2175,7 @@
             <w:rFonts w:ascii="Arial" w:hAnsi="Arial" w:cs="Arial"/>
             <w:b w:val="0"/>
             <w:bCs w:val="0"/>
-            <w:rPrChange w:id="133" w:author="PeepT ㅤ" w:date="2025-06-13T11:48:00Z">
+            <w:rPrChange w:id="148" w:author="PeepT ㅤ" w:date="2025-06-13T11:48:00Z">
               <w:rPr>
                 <w:rStyle w:val="Forte"/>
               </w:rPr>
@@ -2030,7 +2184,7 @@
           <w:t>checklists dinâmicos vinculados ao empreendimento</w:t>
         </w:r>
       </w:ins>
-      <w:ins w:id="134" w:author="PeepT ㅤ" w:date="2025-06-13T11:48:00Z">
+      <w:ins w:id="149" w:author="PeepT ㅤ" w:date="2025-06-13T11:48:00Z">
         <w:r>
           <w:rPr>
             <w:rFonts w:ascii="Arial" w:hAnsi="Arial" w:cs="Arial"/>
@@ -2044,7 +2198,7 @@
           <w:br/>
         </w:r>
       </w:ins>
-      <w:ins w:id="135" w:author="PeepT ㅤ" w:date="2025-06-13T12:00:00Z">
+      <w:ins w:id="150" w:author="PeepT ㅤ" w:date="2025-06-13T12:00:00Z">
         <w:r>
           <w:rPr>
             <w:rFonts w:ascii="Arial" w:hAnsi="Arial" w:cs="Arial"/>
@@ -2052,11 +2206,11 @@
           <w:t xml:space="preserve">- </w:t>
         </w:r>
       </w:ins>
-      <w:ins w:id="136" w:author="PeepT ㅤ" w:date="2025-06-13T11:47:00Z">
-        <w:r>
-          <w:rPr>
-            <w:rFonts w:ascii="Arial" w:hAnsi="Arial" w:cs="Arial"/>
-            <w:rPrChange w:id="137" w:author="PeepT ㅤ" w:date="2025-06-13T11:48:00Z">
+      <w:ins w:id="151" w:author="PeepT ㅤ" w:date="2025-06-13T11:47:00Z">
+        <w:r>
+          <w:rPr>
+            <w:rFonts w:ascii="Arial" w:hAnsi="Arial" w:cs="Arial"/>
+            <w:rPrChange w:id="152" w:author="PeepT ㅤ" w:date="2025-06-13T11:48:00Z">
               <w:rPr/>
             </w:rPrChange>
           </w:rPr>
@@ -2068,7 +2222,7 @@
             <w:rFonts w:ascii="Arial" w:hAnsi="Arial" w:cs="Arial"/>
             <w:b w:val="0"/>
             <w:bCs w:val="0"/>
-            <w:rPrChange w:id="138" w:author="PeepT ㅤ" w:date="2025-06-13T11:48:00Z">
+            <w:rPrChange w:id="153" w:author="PeepT ㅤ" w:date="2025-06-13T11:48:00Z">
               <w:rPr>
                 <w:rStyle w:val="Forte"/>
               </w:rPr>
@@ -2079,7 +2233,7 @@
         <w:r>
           <w:rPr>
             <w:rFonts w:ascii="Arial" w:hAnsi="Arial" w:cs="Arial"/>
-            <w:rPrChange w:id="139" w:author="PeepT ㅤ" w:date="2025-06-13T11:48:00Z">
+            <w:rPrChange w:id="154" w:author="PeepT ㅤ" w:date="2025-06-13T11:48:00Z">
               <w:rPr/>
             </w:rPrChange>
           </w:rPr>
@@ -2100,11 +2254,11 @@
           <w:between w:val="nil"/>
         </w:pBdr>
         <w:rPr>
-          <w:del w:id="140" w:author="PeepT ㅤ" w:date="2025-06-13T11:46:00Z"/>
-          <w:rFonts w:ascii="Arial" w:hAnsi="Arial" w:cs="Arial"/>
-        </w:rPr>
-      </w:pPr>
-      <w:del w:id="141" w:author="PeepT ㅤ" w:date="2025-06-13T11:46:00Z">
+          <w:del w:id="155" w:author="PeepT ㅤ" w:date="2025-06-13T11:46:00Z"/>
+          <w:rFonts w:ascii="Arial" w:hAnsi="Arial" w:cs="Arial"/>
+        </w:rPr>
+      </w:pPr>
+      <w:del w:id="156" w:author="PeepT ㅤ" w:date="2025-06-13T11:46:00Z">
         <w:r>
           <w:rPr>
             <w:rFonts w:ascii="Arial" w:hAnsi="Arial" w:cs="Arial"/>
@@ -2122,7 +2276,7 @@
         <w:spacing w:before="119" w:line="360" w:lineRule="auto"/>
         <w:ind w:right="295"/>
         <w:rPr>
-          <w:ins w:id="142" w:author="PeepT ㅤ" w:date="2025-06-13T12:01:00Z"/>
+          <w:ins w:id="157" w:author="PeepT ㅤ" w:date="2025-06-13T12:01:00Z"/>
           <w:rFonts w:ascii="Arial" w:hAnsi="Arial" w:cs="Arial"/>
           <w:i/>
           <w:iCs/>
@@ -2271,7 +2425,7 @@
               </w:rPr>
               <w:t xml:space="preserve">1. Nome: </w:t>
             </w:r>
-            <w:ins w:id="143" w:author="PeepT ㅤ" w:date="2025-06-13T11:56:00Z">
+            <w:ins w:id="158" w:author="PeepT ㅤ" w:date="2025-06-13T11:56:00Z">
               <w:r>
                 <w:rPr>
                   <w:rFonts w:ascii="Arial" w:hAnsi="Arial" w:cs="Arial"/>
@@ -2319,7 +2473,7 @@
               </w:rPr>
               <w:t>Instituição:</w:t>
             </w:r>
-            <w:ins w:id="144" w:author="PeepT ㅤ" w:date="2025-06-13T11:49:00Z">
+            <w:ins w:id="159" w:author="PeepT ㅤ" w:date="2025-06-13T11:49:00Z">
               <w:r>
                 <w:rPr>
                   <w:rFonts w:ascii="Arial" w:hAnsi="Arial" w:cs="Arial"/>
@@ -2360,7 +2514,7 @@
               </w:rPr>
               <w:t>Vínculo:</w:t>
             </w:r>
-            <w:ins w:id="145" w:author="PeepT ㅤ" w:date="2025-06-13T11:49:00Z">
+            <w:ins w:id="160" w:author="PeepT ㅤ" w:date="2025-06-13T11:49:00Z">
               <w:r>
                 <w:rPr>
                   <w:rFonts w:ascii="Arial" w:hAnsi="Arial" w:cs="Arial"/>
@@ -2376,7 +2530,7 @@
               </w:rPr>
               <w:t xml:space="preserve"> </w:t>
             </w:r>
-            <w:del w:id="146" w:author="PeepT ㅤ" w:date="2025-06-13T11:49:00Z">
+            <w:del w:id="161" w:author="PeepT ㅤ" w:date="2025-06-13T11:49:00Z">
               <w:r>
                 <w:rPr>
                   <w:rFonts w:ascii="Arial" w:hAnsi="Arial" w:cs="Arial"/>
@@ -2537,7 +2691,7 @@
               </w:rPr>
               <w:t xml:space="preserve">Nacionalidade: </w:t>
             </w:r>
-            <w:ins w:id="147" w:author="PeepT ㅤ" w:date="2025-06-13T11:49:00Z">
+            <w:ins w:id="162" w:author="PeepT ㅤ" w:date="2025-06-13T11:49:00Z">
               <w:r>
                 <w:rPr>
                   <w:rFonts w:ascii="Arial" w:hAnsi="Arial" w:cs="Arial"/>
@@ -2545,7 +2699,7 @@
                 <w:t>Brasileir</w:t>
               </w:r>
             </w:ins>
-            <w:ins w:id="148" w:author="PeepT ㅤ" w:date="2025-06-13T11:59:00Z">
+            <w:ins w:id="163" w:author="PeepT ㅤ" w:date="2025-06-13T11:59:00Z">
               <w:r>
                 <w:rPr>
                   <w:rFonts w:ascii="Arial" w:hAnsi="Arial" w:cs="Arial"/>
@@ -2580,7 +2734,7 @@
           <w:p>
             <w:pPr>
               <w:rPr>
-                <w:del w:id="149" w:author="PeepT ㅤ" w:date="2025-06-13T11:54:00Z"/>
+                <w:del w:id="164" w:author="PeepT ㅤ" w:date="2025-06-13T11:54:00Z"/>
                 <w:rFonts w:ascii="Arial" w:hAnsi="Arial" w:cs="Arial"/>
               </w:rPr>
             </w:pPr>
@@ -2591,7 +2745,7 @@
               <w:lastRenderedPageBreak/>
               <w:t>Qualificação Física</w:t>
             </w:r>
-            <w:ins w:id="150" w:author="PeepT ㅤ" w:date="2025-06-13T11:54:00Z">
+            <w:ins w:id="165" w:author="PeepT ㅤ" w:date="2025-06-13T11:54:00Z">
               <w:r>
                 <w:rPr>
                   <w:rFonts w:ascii="Arial" w:hAnsi="Arial" w:cs="Arial"/>
@@ -2599,7 +2753,7 @@
                 <w:t>: Estudante de Graduação</w:t>
               </w:r>
             </w:ins>
-            <w:del w:id="151" w:author="PeepT ㅤ" w:date="2025-06-13T11:54:00Z">
+            <w:del w:id="166" w:author="PeepT ㅤ" w:date="2025-06-13T11:54:00Z">
               <w:r>
                 <w:rPr>
                   <w:rFonts w:ascii="Arial" w:hAnsi="Arial" w:cs="Arial"/>
@@ -2613,14 +2767,14 @@
               <w:rPr>
                 <w:rFonts w:ascii="Arial" w:hAnsi="Arial" w:cs="Arial"/>
               </w:rPr>
-              <w:pPrChange w:id="152" w:author="PeepT ㅤ" w:date="2025-06-13T11:54:00Z">
+              <w:pPrChange w:id="167" w:author="PeepT ㅤ" w:date="2025-06-13T11:54:00Z">
                 <w:pPr>
                   <w:spacing w:line="276" w:lineRule="auto"/>
                   <w:ind w:left="100"/>
                 </w:pPr>
               </w:pPrChange>
             </w:pPr>
-            <w:del w:id="153" w:author="PeepT ㅤ" w:date="2025-06-13T11:54:00Z">
+            <w:del w:id="168" w:author="PeepT ㅤ" w:date="2025-06-13T11:54:00Z">
               <w:r>
                 <w:rPr>
                   <w:rFonts w:ascii="Arial" w:hAnsi="Arial" w:cs="Arial"/>
@@ -2706,7 +2860,7 @@
               </w:rPr>
               <w:t xml:space="preserve">Cidade: </w:t>
             </w:r>
-            <w:ins w:id="154" w:author="PeepT ㅤ" w:date="2025-06-13T11:50:00Z">
+            <w:ins w:id="169" w:author="PeepT ㅤ" w:date="2025-06-13T11:50:00Z">
               <w:r>
                 <w:rPr>
                   <w:rFonts w:ascii="Arial" w:hAnsi="Arial" w:cs="Arial"/>
@@ -2747,7 +2901,7 @@
               </w:rPr>
               <w:t xml:space="preserve">Estado: </w:t>
             </w:r>
-            <w:ins w:id="155" w:author="PeepT ㅤ" w:date="2025-06-13T11:50:00Z">
+            <w:ins w:id="170" w:author="PeepT ㅤ" w:date="2025-06-13T11:50:00Z">
               <w:r>
                 <w:rPr>
                   <w:rFonts w:ascii="Arial" w:hAnsi="Arial" w:cs="Arial"/>
@@ -2828,7 +2982,7 @@
               </w:rPr>
               <w:t xml:space="preserve">País: </w:t>
             </w:r>
-            <w:ins w:id="156" w:author="PeepT ㅤ" w:date="2025-06-13T11:50:00Z">
+            <w:ins w:id="171" w:author="PeepT ㅤ" w:date="2025-06-13T11:50:00Z">
               <w:r>
                 <w:rPr>
                   <w:rFonts w:ascii="Arial" w:hAnsi="Arial" w:cs="Arial"/>
@@ -2946,7 +3100,7 @@
               </w:rPr>
               <w:t xml:space="preserve">E-mail: </w:t>
             </w:r>
-            <w:ins w:id="157" w:author="PeepT ㅤ" w:date="2025-06-13T11:50:00Z">
+            <w:ins w:id="172" w:author="PeepT ㅤ" w:date="2025-06-13T11:50:00Z">
               <w:r>
                 <w:rPr>
                   <w:rFonts w:ascii="Arial" w:hAnsi="Arial" w:cs="Arial"/>
@@ -3035,7 +3189,7 @@
               </w:rPr>
               <w:t xml:space="preserve">2. Nome: </w:t>
             </w:r>
-            <w:ins w:id="158" w:author="PeepT ㅤ" w:date="2025-06-13T11:56:00Z">
+            <w:ins w:id="173" w:author="PeepT ㅤ" w:date="2025-06-13T11:56:00Z">
               <w:r>
                 <w:rPr>
                   <w:rFonts w:ascii="Arial" w:hAnsi="Arial" w:cs="Arial"/>
@@ -3086,7 +3240,7 @@
               </w:rPr>
               <w:t>Instituição:</w:t>
             </w:r>
-            <w:ins w:id="159" w:author="PeepT ㅤ" w:date="2025-06-13T11:50:00Z">
+            <w:ins w:id="174" w:author="PeepT ㅤ" w:date="2025-06-13T11:50:00Z">
               <w:r>
                 <w:rPr>
                   <w:rFonts w:ascii="Arial" w:hAnsi="Arial" w:cs="Arial"/>
@@ -3130,7 +3284,7 @@
               </w:rPr>
               <w:t xml:space="preserve">Vínculo: </w:t>
             </w:r>
-            <w:ins w:id="160" w:author="PeepT ㅤ" w:date="2025-06-13T11:51:00Z">
+            <w:ins w:id="175" w:author="PeepT ㅤ" w:date="2025-06-13T11:51:00Z">
               <w:r>
                 <w:rPr>
                   <w:rFonts w:ascii="Arial" w:hAnsi="Arial" w:cs="Arial"/>
@@ -3139,7 +3293,7 @@
                 <w:t>Estudante</w:t>
               </w:r>
             </w:ins>
-            <w:del w:id="161" w:author="PeepT ㅤ" w:date="2025-06-13T11:51:00Z">
+            <w:del w:id="176" w:author="PeepT ㅤ" w:date="2025-06-13T11:51:00Z">
               <w:r>
                 <w:rPr>
                   <w:rFonts w:ascii="Arial" w:hAnsi="Arial" w:cs="Arial"/>
@@ -3303,7 +3457,7 @@
               </w:rPr>
               <w:t>Nacionalidade: Brasileir</w:t>
             </w:r>
-            <w:ins w:id="162" w:author="PeepT ㅤ" w:date="2025-06-13T12:00:00Z">
+            <w:ins w:id="177" w:author="PeepT ㅤ" w:date="2025-06-13T12:00:00Z">
               <w:r>
                 <w:rPr>
                   <w:rFonts w:ascii="Arial" w:hAnsi="Arial" w:cs="Arial"/>
@@ -3311,7 +3465,7 @@
                 <w:t>o</w:t>
               </w:r>
             </w:ins>
-            <w:del w:id="163" w:author="PeepT ㅤ" w:date="2025-06-13T11:59:00Z">
+            <w:del w:id="178" w:author="PeepT ㅤ" w:date="2025-06-13T11:59:00Z">
               <w:r>
                 <w:rPr>
                   <w:rFonts w:ascii="Arial" w:hAnsi="Arial" w:cs="Arial"/>
@@ -3346,7 +3500,7 @@
           <w:p>
             <w:pPr>
               <w:rPr>
-                <w:del w:id="164" w:author="PeepT ㅤ" w:date="2025-06-13T11:55:00Z"/>
+                <w:del w:id="179" w:author="PeepT ㅤ" w:date="2025-06-13T11:55:00Z"/>
                 <w:rFonts w:ascii="Arial" w:hAnsi="Arial" w:cs="Arial"/>
               </w:rPr>
             </w:pPr>
@@ -3356,7 +3510,7 @@
               </w:rPr>
               <w:t xml:space="preserve">Qualificação Física: </w:t>
             </w:r>
-            <w:ins w:id="165" w:author="PeepT ㅤ" w:date="2025-06-13T11:55:00Z">
+            <w:ins w:id="180" w:author="PeepT ㅤ" w:date="2025-06-13T11:55:00Z">
               <w:r>
                 <w:rPr>
                   <w:rFonts w:ascii="Arial" w:hAnsi="Arial" w:cs="Arial"/>
@@ -3370,14 +3524,14 @@
               <w:rPr>
                 <w:rFonts w:ascii="Arial" w:hAnsi="Arial" w:cs="Arial"/>
               </w:rPr>
-              <w:pPrChange w:id="166" w:author="PeepT ㅤ" w:date="2025-06-13T11:55:00Z">
+              <w:pPrChange w:id="181" w:author="PeepT ㅤ" w:date="2025-06-13T11:55:00Z">
                 <w:pPr>
                   <w:spacing w:line="276" w:lineRule="auto"/>
                   <w:ind w:left="100"/>
                 </w:pPr>
               </w:pPrChange>
             </w:pPr>
-            <w:del w:id="167" w:author="PeepT ㅤ" w:date="2025-06-13T11:55:00Z">
+            <w:del w:id="182" w:author="PeepT ㅤ" w:date="2025-06-13T11:55:00Z">
               <w:r>
                 <w:rPr>
                   <w:rFonts w:ascii="Arial" w:hAnsi="Arial" w:cs="Arial"/>
@@ -3679,7 +3833,7 @@
               </w:rPr>
               <w:t xml:space="preserve">E-mail: </w:t>
             </w:r>
-            <w:ins w:id="168" w:author="PeepT ㅤ" w:date="2025-06-13T11:56:00Z">
+            <w:ins w:id="183" w:author="PeepT ㅤ" w:date="2025-06-13T11:56:00Z">
               <w:r>
                 <w:rPr>
                   <w:rFonts w:ascii="Arial" w:hAnsi="Arial" w:cs="Arial"/>
@@ -3766,7 +3920,7 @@
               </w:rPr>
               <w:t xml:space="preserve">3. Nome: </w:t>
             </w:r>
-            <w:ins w:id="169" w:author="PeepT ㅤ" w:date="2025-06-13T11:57:00Z">
+            <w:ins w:id="184" w:author="PeepT ㅤ" w:date="2025-06-13T11:57:00Z">
               <w:r>
                 <w:rPr>
                   <w:rFonts w:ascii="Arial" w:hAnsi="Arial" w:cs="Arial"/>
@@ -3814,7 +3968,7 @@
               </w:rPr>
               <w:t>Instituição:</w:t>
             </w:r>
-            <w:ins w:id="170" w:author="PeepT ㅤ" w:date="2025-06-13T11:53:00Z">
+            <w:ins w:id="185" w:author="PeepT ㅤ" w:date="2025-06-13T11:53:00Z">
               <w:r>
                 <w:rPr>
                   <w:rFonts w:ascii="Arial" w:hAnsi="Arial" w:cs="Arial"/>
@@ -3855,7 +4009,7 @@
               </w:rPr>
               <w:t xml:space="preserve">Vínculo: </w:t>
             </w:r>
-            <w:ins w:id="171" w:author="PeepT ㅤ" w:date="2025-06-13T11:51:00Z">
+            <w:ins w:id="186" w:author="PeepT ㅤ" w:date="2025-06-13T11:51:00Z">
               <w:r>
                 <w:rPr>
                   <w:rFonts w:ascii="Arial" w:hAnsi="Arial" w:cs="Arial"/>
@@ -3864,7 +4018,7 @@
                 <w:t>Estudante</w:t>
               </w:r>
             </w:ins>
-            <w:del w:id="172" w:author="PeepT ㅤ" w:date="2025-06-13T11:51:00Z">
+            <w:del w:id="187" w:author="PeepT ㅤ" w:date="2025-06-13T11:51:00Z">
               <w:r>
                 <w:rPr>
                   <w:rFonts w:ascii="Arial" w:hAnsi="Arial" w:cs="Arial"/>
@@ -4052,7 +4206,7 @@
           <w:p>
             <w:pPr>
               <w:rPr>
-                <w:del w:id="173" w:author="PeepT ㅤ" w:date="2025-06-13T11:54:00Z"/>
+                <w:del w:id="188" w:author="PeepT ㅤ" w:date="2025-06-13T11:54:00Z"/>
                 <w:rFonts w:ascii="Arial" w:hAnsi="Arial" w:cs="Arial"/>
               </w:rPr>
             </w:pPr>
@@ -4069,14 +4223,14 @@
               <w:rPr>
                 <w:rFonts w:ascii="Arial" w:hAnsi="Arial" w:cs="Arial"/>
               </w:rPr>
-              <w:pPrChange w:id="174" w:author="PeepT ㅤ" w:date="2025-06-13T11:54:00Z">
+              <w:pPrChange w:id="189" w:author="PeepT ㅤ" w:date="2025-06-13T11:54:00Z">
                 <w:pPr>
                   <w:spacing w:line="276" w:lineRule="auto"/>
                   <w:ind w:left="100"/>
                 </w:pPr>
               </w:pPrChange>
             </w:pPr>
-            <w:ins w:id="175" w:author="PeepT ㅤ" w:date="2025-06-13T11:54:00Z">
+            <w:ins w:id="190" w:author="PeepT ㅤ" w:date="2025-06-13T11:54:00Z">
               <w:r>
                 <w:rPr>
                   <w:rFonts w:ascii="Arial" w:hAnsi="Arial" w:cs="Arial"/>
@@ -4084,7 +4238,7 @@
                 <w:t>Estudante de Graduação</w:t>
               </w:r>
             </w:ins>
-            <w:del w:id="176" w:author="PeepT ㅤ" w:date="2025-06-13T11:54:00Z">
+            <w:del w:id="191" w:author="PeepT ㅤ" w:date="2025-06-13T11:54:00Z">
               <w:r>
                 <w:rPr>
                   <w:rFonts w:ascii="Arial" w:hAnsi="Arial" w:cs="Arial"/>
@@ -4170,7 +4324,7 @@
               </w:rPr>
               <w:t xml:space="preserve">Cidade: </w:t>
             </w:r>
-            <w:ins w:id="177" w:author="PeepT ㅤ" w:date="2025-06-13T11:53:00Z">
+            <w:ins w:id="192" w:author="PeepT ㅤ" w:date="2025-06-13T11:53:00Z">
               <w:r>
                 <w:rPr>
                   <w:rFonts w:ascii="Arial" w:hAnsi="Arial" w:cs="Arial"/>
@@ -4211,7 +4365,7 @@
               </w:rPr>
               <w:t>Estado:</w:t>
             </w:r>
-            <w:ins w:id="178" w:author="PeepT ㅤ" w:date="2025-06-13T11:52:00Z">
+            <w:ins w:id="193" w:author="PeepT ㅤ" w:date="2025-06-13T11:52:00Z">
               <w:r>
                 <w:rPr>
                   <w:rFonts w:ascii="Arial" w:hAnsi="Arial" w:cs="Arial"/>
@@ -4219,7 +4373,7 @@
                 <w:t xml:space="preserve"> Maranhã</w:t>
               </w:r>
             </w:ins>
-            <w:ins w:id="179" w:author="PeepT ㅤ" w:date="2025-06-13T11:53:00Z">
+            <w:ins w:id="194" w:author="PeepT ㅤ" w:date="2025-06-13T11:53:00Z">
               <w:r>
                 <w:rPr>
                   <w:rFonts w:ascii="Arial" w:hAnsi="Arial" w:cs="Arial"/>
@@ -4298,7 +4452,7 @@
               </w:rPr>
               <w:t xml:space="preserve">País: </w:t>
             </w:r>
-            <w:ins w:id="180" w:author="PeepT ㅤ" w:date="2025-06-13T11:52:00Z">
+            <w:ins w:id="195" w:author="PeepT ㅤ" w:date="2025-06-13T11:52:00Z">
               <w:r>
                 <w:rPr>
                   <w:rFonts w:ascii="Arial" w:hAnsi="Arial" w:cs="Arial"/>
@@ -4416,7 +4570,7 @@
               </w:rPr>
               <w:t xml:space="preserve">E-mail: </w:t>
             </w:r>
-            <w:ins w:id="181" w:author="PeepT ㅤ" w:date="2025-06-13T11:57:00Z">
+            <w:ins w:id="196" w:author="PeepT ㅤ" w:date="2025-06-13T11:57:00Z">
               <w:r>
                 <w:rPr>
                   <w:rFonts w:ascii="Arial" w:hAnsi="Arial" w:cs="Arial"/>
@@ -4506,7 +4660,7 @@
               </w:rPr>
               <w:t xml:space="preserve">4. Nome: </w:t>
             </w:r>
-            <w:ins w:id="182" w:author="PeepT ㅤ" w:date="2025-06-13T11:57:00Z">
+            <w:ins w:id="197" w:author="PeepT ㅤ" w:date="2025-06-13T11:57:00Z">
               <w:r>
                 <w:rPr>
                   <w:rFonts w:ascii="Arial" w:hAnsi="Arial" w:cs="Arial"/>
@@ -4557,7 +4711,7 @@
               </w:rPr>
               <w:t>Instituição:</w:t>
             </w:r>
-            <w:ins w:id="183" w:author="PeepT ㅤ" w:date="2025-06-13T11:53:00Z">
+            <w:ins w:id="198" w:author="PeepT ㅤ" w:date="2025-06-13T11:53:00Z">
               <w:r>
                 <w:rPr>
                   <w:rFonts w:ascii="Arial" w:hAnsi="Arial" w:cs="Arial"/>
@@ -4601,7 +4755,7 @@
               </w:rPr>
               <w:t xml:space="preserve">Vínculo: </w:t>
             </w:r>
-            <w:ins w:id="184" w:author="PeepT ㅤ" w:date="2025-06-13T11:51:00Z">
+            <w:ins w:id="199" w:author="PeepT ㅤ" w:date="2025-06-13T11:51:00Z">
               <w:r>
                 <w:rPr>
                   <w:rFonts w:ascii="Arial" w:hAnsi="Arial" w:cs="Arial"/>
@@ -4610,7 +4764,7 @@
                 <w:t>Estudante</w:t>
               </w:r>
             </w:ins>
-            <w:del w:id="185" w:author="PeepT ㅤ" w:date="2025-06-13T11:51:00Z">
+            <w:del w:id="200" w:author="PeepT ㅤ" w:date="2025-06-13T11:51:00Z">
               <w:r>
                 <w:rPr>
                   <w:rFonts w:ascii="Arial" w:hAnsi="Arial" w:cs="Arial"/>
@@ -4774,7 +4928,7 @@
               </w:rPr>
               <w:t xml:space="preserve">Nacionalidade: </w:t>
             </w:r>
-            <w:ins w:id="186" w:author="PeepT ㅤ" w:date="2025-06-13T11:51:00Z">
+            <w:ins w:id="201" w:author="PeepT ㅤ" w:date="2025-06-13T11:51:00Z">
               <w:r>
                 <w:rPr>
                   <w:rFonts w:ascii="Arial" w:hAnsi="Arial" w:cs="Arial"/>
@@ -4809,7 +4963,7 @@
           <w:p>
             <w:pPr>
               <w:rPr>
-                <w:del w:id="187" w:author="PeepT ㅤ" w:date="2025-06-13T11:55:00Z"/>
+                <w:del w:id="202" w:author="PeepT ㅤ" w:date="2025-06-13T11:55:00Z"/>
                 <w:rFonts w:ascii="Arial" w:hAnsi="Arial" w:cs="Arial"/>
               </w:rPr>
             </w:pPr>
@@ -4819,7 +4973,7 @@
               </w:rPr>
               <w:t xml:space="preserve">Qualificação Física: </w:t>
             </w:r>
-            <w:ins w:id="188" w:author="PeepT ㅤ" w:date="2025-06-13T11:55:00Z">
+            <w:ins w:id="203" w:author="PeepT ㅤ" w:date="2025-06-13T11:55:00Z">
               <w:r>
                 <w:rPr>
                   <w:rFonts w:ascii="Arial" w:hAnsi="Arial" w:cs="Arial"/>
@@ -4833,14 +4987,14 @@
               <w:rPr>
                 <w:rFonts w:ascii="Arial" w:hAnsi="Arial" w:cs="Arial"/>
               </w:rPr>
-              <w:pPrChange w:id="189" w:author="PeepT ㅤ" w:date="2025-06-13T11:55:00Z">
+              <w:pPrChange w:id="204" w:author="PeepT ㅤ" w:date="2025-06-13T11:55:00Z">
                 <w:pPr>
                   <w:spacing w:line="276" w:lineRule="auto"/>
                   <w:ind w:left="100"/>
                 </w:pPr>
               </w:pPrChange>
             </w:pPr>
-            <w:del w:id="190" w:author="PeepT ㅤ" w:date="2025-06-13T11:55:00Z">
+            <w:del w:id="205" w:author="PeepT ㅤ" w:date="2025-06-13T11:55:00Z">
               <w:r>
                 <w:rPr>
                   <w:rFonts w:ascii="Arial" w:hAnsi="Arial" w:cs="Arial"/>
@@ -4926,7 +5080,7 @@
               </w:rPr>
               <w:t xml:space="preserve">Cidade: </w:t>
             </w:r>
-            <w:ins w:id="191" w:author="PeepT ㅤ" w:date="2025-06-13T11:51:00Z">
+            <w:ins w:id="206" w:author="PeepT ㅤ" w:date="2025-06-13T11:51:00Z">
               <w:r>
                 <w:rPr>
                   <w:rFonts w:ascii="Arial" w:hAnsi="Arial" w:cs="Arial"/>
@@ -4934,7 +5088,7 @@
                 <w:t>S</w:t>
               </w:r>
             </w:ins>
-            <w:ins w:id="192" w:author="PeepT ㅤ" w:date="2025-06-13T11:52:00Z">
+            <w:ins w:id="207" w:author="PeepT ㅤ" w:date="2025-06-13T11:52:00Z">
               <w:r>
                 <w:rPr>
                   <w:rFonts w:ascii="Arial" w:hAnsi="Arial" w:cs="Arial"/>
@@ -4975,7 +5129,7 @@
               </w:rPr>
               <w:t xml:space="preserve">Estado: </w:t>
             </w:r>
-            <w:ins w:id="193" w:author="PeepT ㅤ" w:date="2025-06-13T11:51:00Z">
+            <w:ins w:id="208" w:author="PeepT ㅤ" w:date="2025-06-13T11:51:00Z">
               <w:r>
                 <w:rPr>
                   <w:rFonts w:ascii="Arial" w:hAnsi="Arial" w:cs="Arial"/>
@@ -5054,7 +5208,7 @@
               </w:rPr>
               <w:t>País:</w:t>
             </w:r>
-            <w:ins w:id="194" w:author="PeepT ㅤ" w:date="2025-06-13T11:52:00Z">
+            <w:ins w:id="209" w:author="PeepT ㅤ" w:date="2025-06-13T11:52:00Z">
               <w:r>
                 <w:rPr>
                   <w:rFonts w:ascii="Arial" w:hAnsi="Arial" w:cs="Arial"/>
@@ -5172,7 +5326,7 @@
               </w:rPr>
               <w:t xml:space="preserve">E-mail: </w:t>
             </w:r>
-            <w:ins w:id="195" w:author="PeepT ㅤ" w:date="2025-06-13T11:57:00Z">
+            <w:ins w:id="210" w:author="PeepT ㅤ" w:date="2025-06-13T11:57:00Z">
               <w:r>
                 <w:rPr>
                   <w:rFonts w:ascii="Arial" w:hAnsi="Arial" w:cs="Arial"/>
@@ -5180,7 +5334,7 @@
                 <w:t>bruno.kauan@</w:t>
               </w:r>
             </w:ins>
-            <w:ins w:id="196" w:author="PeepT ㅤ" w:date="2025-06-13T11:58:00Z">
+            <w:ins w:id="211" w:author="PeepT ㅤ" w:date="2025-06-13T11:58:00Z">
               <w:r>
                 <w:rPr>
                   <w:rFonts w:ascii="Arial" w:hAnsi="Arial" w:cs="Arial"/>
@@ -5267,7 +5421,7 @@
               </w:rPr>
               <w:t xml:space="preserve">5. Nome: </w:t>
             </w:r>
-            <w:ins w:id="197" w:author="PeepT ㅤ" w:date="2025-06-13T11:58:00Z">
+            <w:ins w:id="212" w:author="PeepT ㅤ" w:date="2025-06-13T11:58:00Z">
               <w:r>
                 <w:rPr>
                   <w:rFonts w:ascii="Arial" w:hAnsi="Arial" w:cs="Arial"/>
@@ -5315,7 +5469,7 @@
               </w:rPr>
               <w:t>Instituição:</w:t>
             </w:r>
-            <w:ins w:id="198" w:author="PeepT ㅤ" w:date="2025-06-13T11:53:00Z">
+            <w:ins w:id="213" w:author="PeepT ㅤ" w:date="2025-06-13T11:53:00Z">
               <w:r>
                 <w:rPr>
                   <w:rFonts w:ascii="Arial" w:hAnsi="Arial" w:cs="Arial"/>
@@ -5356,7 +5510,7 @@
               </w:rPr>
               <w:t xml:space="preserve">Vínculo: </w:t>
             </w:r>
-            <w:ins w:id="199" w:author="PeepT ㅤ" w:date="2025-06-13T11:52:00Z">
+            <w:ins w:id="214" w:author="PeepT ㅤ" w:date="2025-06-13T11:52:00Z">
               <w:r>
                 <w:rPr>
                   <w:rFonts w:ascii="Arial" w:hAnsi="Arial" w:cs="Arial"/>
@@ -5365,7 +5519,7 @@
                 <w:t>Estudante</w:t>
               </w:r>
             </w:ins>
-            <w:del w:id="200" w:author="PeepT ㅤ" w:date="2025-06-13T11:52:00Z">
+            <w:del w:id="215" w:author="PeepT ㅤ" w:date="2025-06-13T11:52:00Z">
               <w:r>
                 <w:rPr>
                   <w:rFonts w:ascii="Arial" w:hAnsi="Arial" w:cs="Arial"/>
@@ -5526,7 +5680,7 @@
               </w:rPr>
               <w:t>Nacionalidade:</w:t>
             </w:r>
-            <w:ins w:id="201" w:author="PeepT ㅤ" w:date="2025-06-13T11:52:00Z">
+            <w:ins w:id="216" w:author="PeepT ㅤ" w:date="2025-06-13T11:52:00Z">
               <w:r>
                 <w:rPr>
                   <w:rFonts w:ascii="Arial" w:hAnsi="Arial" w:cs="Arial"/>
@@ -5561,7 +5715,7 @@
           <w:p>
             <w:pPr>
               <w:rPr>
-                <w:del w:id="202" w:author="PeepT ㅤ" w:date="2025-06-13T11:55:00Z"/>
+                <w:del w:id="217" w:author="PeepT ㅤ" w:date="2025-06-13T11:55:00Z"/>
                 <w:rFonts w:ascii="Arial" w:hAnsi="Arial" w:cs="Arial"/>
               </w:rPr>
             </w:pPr>
@@ -5572,7 +5726,7 @@
               <w:lastRenderedPageBreak/>
               <w:t xml:space="preserve">Qualificação Física: </w:t>
             </w:r>
-            <w:ins w:id="203" w:author="PeepT ㅤ" w:date="2025-06-13T11:55:00Z">
+            <w:ins w:id="218" w:author="PeepT ㅤ" w:date="2025-06-13T11:55:00Z">
               <w:r>
                 <w:rPr>
                   <w:rFonts w:ascii="Arial" w:hAnsi="Arial" w:cs="Arial"/>
@@ -5586,14 +5740,14 @@
               <w:rPr>
                 <w:rFonts w:ascii="Arial" w:hAnsi="Arial" w:cs="Arial"/>
               </w:rPr>
-              <w:pPrChange w:id="204" w:author="PeepT ㅤ" w:date="2025-06-13T11:55:00Z">
+              <w:pPrChange w:id="219" w:author="PeepT ㅤ" w:date="2025-06-13T11:55:00Z">
                 <w:pPr>
                   <w:spacing w:line="276" w:lineRule="auto"/>
                   <w:ind w:left="100"/>
                 </w:pPr>
               </w:pPrChange>
             </w:pPr>
-            <w:del w:id="205" w:author="PeepT ㅤ" w:date="2025-06-13T11:55:00Z">
+            <w:del w:id="220" w:author="PeepT ㅤ" w:date="2025-06-13T11:55:00Z">
               <w:r>
                 <w:rPr>
                   <w:rFonts w:ascii="Arial" w:hAnsi="Arial" w:cs="Arial"/>
@@ -5679,7 +5833,7 @@
               </w:rPr>
               <w:t>Cidade:</w:t>
             </w:r>
-            <w:ins w:id="206" w:author="PeepT ㅤ" w:date="2025-06-13T11:52:00Z">
+            <w:ins w:id="221" w:author="PeepT ㅤ" w:date="2025-06-13T11:52:00Z">
               <w:r>
                 <w:rPr>
                   <w:rFonts w:ascii="Arial" w:hAnsi="Arial" w:cs="Arial"/>
@@ -5720,7 +5874,7 @@
               </w:rPr>
               <w:t xml:space="preserve">Estado: </w:t>
             </w:r>
-            <w:ins w:id="207" w:author="PeepT ㅤ" w:date="2025-06-13T11:52:00Z">
+            <w:ins w:id="222" w:author="PeepT ㅤ" w:date="2025-06-13T11:52:00Z">
               <w:r>
                 <w:rPr>
                   <w:rFonts w:ascii="Arial" w:hAnsi="Arial" w:cs="Arial"/>
@@ -5909,7 +6063,7 @@
               </w:rPr>
               <w:t xml:space="preserve">E-mail: </w:t>
             </w:r>
-            <w:ins w:id="208" w:author="PeepT ㅤ" w:date="2025-06-13T11:58:00Z">
+            <w:ins w:id="223" w:author="PeepT ㅤ" w:date="2025-06-13T11:58:00Z">
               <w:r>
                 <w:rPr>
                   <w:rFonts w:ascii="Arial" w:hAnsi="Arial" w:cs="Arial"/>
@@ -6003,7 +6157,7 @@
         </w:rPr>
         <w:t>São Luís</w:t>
       </w:r>
-      <w:ins w:id="209" w:author="PeepT ㅤ" w:date="2025-06-13T11:55:00Z">
+      <w:ins w:id="224" w:author="PeepT ㅤ" w:date="2025-06-13T11:55:00Z">
         <w:r>
           <w:rPr>
             <w:rFonts w:ascii="Arial" w:hAnsi="Arial" w:cs="Arial"/>
@@ -6017,7 +6171,7 @@
         </w:rPr>
         <w:t xml:space="preserve"> </w:t>
       </w:r>
-      <w:ins w:id="210" w:author="PeepT ㅤ" w:date="2025-06-13T11:55:00Z">
+      <w:ins w:id="225" w:author="PeepT ㅤ" w:date="2025-06-13T11:55:00Z">
         <w:r>
           <w:rPr>
             <w:rFonts w:ascii="Arial" w:hAnsi="Arial" w:cs="Arial"/>
@@ -6031,7 +6185,7 @@
         </w:rPr>
         <w:t xml:space="preserve"> </w:t>
       </w:r>
-      <w:del w:id="211" w:author="PeepT ㅤ" w:date="2025-06-13T11:55:00Z">
+      <w:del w:id="226" w:author="PeepT ㅤ" w:date="2025-06-13T11:55:00Z">
         <w:r>
           <w:rPr>
             <w:rFonts w:ascii="Arial" w:hAnsi="Arial" w:cs="Arial"/>
@@ -6045,7 +6199,7 @@
         </w:rPr>
         <w:t xml:space="preserve">de </w:t>
       </w:r>
-      <w:ins w:id="212" w:author="PeepT ㅤ" w:date="2025-06-13T11:55:00Z">
+      <w:ins w:id="227" w:author="PeepT ㅤ" w:date="2025-06-13T11:55:00Z">
         <w:r>
           <w:rPr>
             <w:rFonts w:ascii="Arial" w:hAnsi="Arial" w:cs="Arial"/>
@@ -6059,7 +6213,7 @@
         </w:rPr>
         <w:t xml:space="preserve"> </w:t>
       </w:r>
-      <w:del w:id="213" w:author="PeepT ㅤ" w:date="2025-06-13T11:55:00Z">
+      <w:del w:id="228" w:author="PeepT ㅤ" w:date="2025-06-13T11:55:00Z">
         <w:r>
           <w:rPr>
             <w:rFonts w:ascii="Arial" w:hAnsi="Arial" w:cs="Arial"/>
@@ -6073,7 +6227,7 @@
         </w:rPr>
         <w:t>de</w:t>
       </w:r>
-      <w:ins w:id="214" w:author="PeepT ㅤ" w:date="2025-06-13T11:55:00Z">
+      <w:ins w:id="229" w:author="PeepT ㅤ" w:date="2025-06-13T11:55:00Z">
         <w:r>
           <w:rPr>
             <w:rFonts w:ascii="Arial" w:hAnsi="Arial" w:cs="Arial"/>
@@ -6081,7 +6235,7 @@
           <w:t xml:space="preserve"> </w:t>
         </w:r>
       </w:ins>
-      <w:ins w:id="215" w:author="PeepT ㅤ" w:date="2025-06-13T11:56:00Z">
+      <w:ins w:id="230" w:author="PeepT ㅤ" w:date="2025-06-13T11:56:00Z">
         <w:r>
           <w:rPr>
             <w:rFonts w:ascii="Arial" w:hAnsi="Arial" w:cs="Arial"/>
@@ -6089,7 +6243,7 @@
           <w:t>2025</w:t>
         </w:r>
       </w:ins>
-      <w:del w:id="216" w:author="PeepT ㅤ" w:date="2025-06-13T11:55:00Z">
+      <w:del w:id="231" w:author="PeepT ㅤ" w:date="2025-06-13T11:55:00Z">
         <w:r>
           <w:rPr>
             <w:rFonts w:ascii="Arial" w:hAnsi="Arial" w:cs="Arial"/>
@@ -6119,12 +6273,12 @@
       <w:pPr>
         <w:spacing w:after="160" w:line="259" w:lineRule="auto"/>
         <w:rPr>
-          <w:ins w:id="217" w:author="BRUNO KAUAN RODRIGUES SILVA" w:date="2025-06-13T18:06:00Z" w16du:dateUtc="2025-06-13T21:06:00Z"/>
+          <w:ins w:id="232" w:author="BRUNO KAUAN RODRIGUES SILVA" w:date="2025-06-13T18:06:00Z" w16du:dateUtc="2025-06-13T21:06:00Z"/>
           <w:rFonts w:ascii="Arial" w:hAnsi="Arial" w:cs="Arial"/>
           <w:color w:val="FF0000"/>
         </w:rPr>
       </w:pPr>
-      <w:ins w:id="218" w:author="BRUNO KAUAN RODRIGUES SILVA" w:date="2025-06-13T18:06:00Z" w16du:dateUtc="2025-06-13T21:06:00Z">
+      <w:ins w:id="233" w:author="BRUNO KAUAN RODRIGUES SILVA" w:date="2025-06-13T18:06:00Z" w16du:dateUtc="2025-06-13T21:06:00Z">
         <w:r>
           <w:rPr>
             <w:rFonts w:ascii="Arial" w:hAnsi="Arial" w:cs="Arial"/>
@@ -6137,14 +6291,14 @@
     <w:p>
       <w:pPr>
         <w:rPr>
-          <w:ins w:id="219" w:author="BRUNO KAUAN RODRIGUES SILVA" w:date="2025-06-13T18:06:00Z" w16du:dateUtc="2025-06-13T21:06:00Z"/>
+          <w:ins w:id="234" w:author="BRUNO KAUAN RODRIGUES SILVA" w:date="2025-06-13T18:06:00Z" w16du:dateUtc="2025-06-13T21:06:00Z"/>
           <w:rFonts w:ascii="Arial" w:hAnsi="Arial" w:cs="Arial"/>
           <w:color w:val="000000" w:themeColor="text1"/>
           <w:sz w:val="22"/>
           <w:szCs w:val="22"/>
         </w:rPr>
       </w:pPr>
-      <w:ins w:id="220" w:author="BRUNO KAUAN RODRIGUES SILVA" w:date="2025-06-13T18:06:00Z" w16du:dateUtc="2025-06-13T21:06:00Z">
+      <w:ins w:id="235" w:author="BRUNO KAUAN RODRIGUES SILVA" w:date="2025-06-13T18:06:00Z" w16du:dateUtc="2025-06-13T21:06:00Z">
         <w:r>
           <w:rPr>
             <w:rFonts w:ascii="Arial" w:hAnsi="Arial" w:cs="Arial"/>
@@ -6160,7 +6314,7 @@
     <w:p>
       <w:pPr>
         <w:rPr>
-          <w:ins w:id="221" w:author="BRUNO KAUAN RODRIGUES SILVA" w:date="2025-06-13T18:06:00Z" w16du:dateUtc="2025-06-13T21:06:00Z"/>
+          <w:ins w:id="236" w:author="BRUNO KAUAN RODRIGUES SILVA" w:date="2025-06-13T18:06:00Z" w16du:dateUtc="2025-06-13T21:06:00Z"/>
           <w:rFonts w:ascii="Arial" w:hAnsi="Arial" w:cs="Arial"/>
           <w:color w:val="000000" w:themeColor="text1"/>
           <w:sz w:val="22"/>
@@ -6171,14 +6325,14 @@
     <w:p>
       <w:pPr>
         <w:rPr>
-          <w:ins w:id="222" w:author="BRUNO KAUAN RODRIGUES SILVA" w:date="2025-06-13T18:06:00Z" w16du:dateUtc="2025-06-13T21:06:00Z"/>
+          <w:ins w:id="237" w:author="BRUNO KAUAN RODRIGUES SILVA" w:date="2025-06-13T18:06:00Z" w16du:dateUtc="2025-06-13T21:06:00Z"/>
           <w:rFonts w:ascii="Arial" w:hAnsi="Arial" w:cs="Arial"/>
           <w:color w:val="000000" w:themeColor="text1"/>
           <w:sz w:val="22"/>
           <w:szCs w:val="22"/>
         </w:rPr>
       </w:pPr>
-      <w:ins w:id="223" w:author="BRUNO KAUAN RODRIGUES SILVA" w:date="2025-06-13T18:06:00Z" w16du:dateUtc="2025-06-13T21:06:00Z">
+      <w:ins w:id="238" w:author="BRUNO KAUAN RODRIGUES SILVA" w:date="2025-06-13T18:06:00Z" w16du:dateUtc="2025-06-13T21:06:00Z">
         <w:r>
           <w:rPr>
             <w:rFonts w:ascii="Arial" w:hAnsi="Arial" w:cs="Arial"/>
@@ -6193,7 +6347,7 @@
     <w:p>
       <w:pPr>
         <w:rPr>
-          <w:ins w:id="224" w:author="BRUNO KAUAN RODRIGUES SILVA" w:date="2025-06-13T18:06:00Z" w16du:dateUtc="2025-06-13T21:06:00Z"/>
+          <w:ins w:id="239" w:author="BRUNO KAUAN RODRIGUES SILVA" w:date="2025-06-13T18:06:00Z" w16du:dateUtc="2025-06-13T21:06:00Z"/>
           <w:rFonts w:ascii="Arial" w:hAnsi="Arial" w:cs="Arial"/>
           <w:color w:val="000000" w:themeColor="text1"/>
           <w:sz w:val="22"/>
@@ -6204,14 +6358,14 @@
     <w:p>
       <w:pPr>
         <w:rPr>
-          <w:ins w:id="225" w:author="BRUNO KAUAN RODRIGUES SILVA" w:date="2025-06-13T18:06:00Z" w16du:dateUtc="2025-06-13T21:06:00Z"/>
+          <w:ins w:id="240" w:author="BRUNO KAUAN RODRIGUES SILVA" w:date="2025-06-13T18:06:00Z" w16du:dateUtc="2025-06-13T21:06:00Z"/>
           <w:rFonts w:ascii="Arial" w:hAnsi="Arial" w:cs="Arial"/>
           <w:color w:val="000000" w:themeColor="text1"/>
           <w:sz w:val="22"/>
           <w:szCs w:val="22"/>
         </w:rPr>
       </w:pPr>
-      <w:ins w:id="226" w:author="BRUNO KAUAN RODRIGUES SILVA" w:date="2025-06-13T18:06:00Z" w16du:dateUtc="2025-06-13T21:06:00Z">
+      <w:ins w:id="241" w:author="BRUNO KAUAN RODRIGUES SILVA" w:date="2025-06-13T18:06:00Z" w16du:dateUtc="2025-06-13T21:06:00Z">
         <w:r>
           <w:rPr>
             <w:rFonts w:ascii="Arial" w:hAnsi="Arial" w:cs="Arial"/>
@@ -6226,7 +6380,7 @@
     <w:p>
       <w:pPr>
         <w:rPr>
-          <w:ins w:id="227" w:author="BRUNO KAUAN RODRIGUES SILVA" w:date="2025-06-13T18:06:00Z" w16du:dateUtc="2025-06-13T21:06:00Z"/>
+          <w:ins w:id="242" w:author="BRUNO KAUAN RODRIGUES SILVA" w:date="2025-06-13T18:06:00Z" w16du:dateUtc="2025-06-13T21:06:00Z"/>
           <w:rFonts w:ascii="Arial" w:hAnsi="Arial" w:cs="Arial"/>
           <w:color w:val="000000" w:themeColor="text1"/>
           <w:sz w:val="22"/>
@@ -6237,14 +6391,14 @@
     <w:p>
       <w:pPr>
         <w:rPr>
-          <w:ins w:id="228" w:author="BRUNO KAUAN RODRIGUES SILVA" w:date="2025-06-13T18:06:00Z" w16du:dateUtc="2025-06-13T21:06:00Z"/>
+          <w:ins w:id="243" w:author="BRUNO KAUAN RODRIGUES SILVA" w:date="2025-06-13T18:06:00Z" w16du:dateUtc="2025-06-13T21:06:00Z"/>
           <w:rFonts w:ascii="Arial" w:hAnsi="Arial" w:cs="Arial"/>
           <w:color w:val="000000" w:themeColor="text1"/>
           <w:sz w:val="22"/>
           <w:szCs w:val="22"/>
         </w:rPr>
       </w:pPr>
-      <w:ins w:id="229" w:author="BRUNO KAUAN RODRIGUES SILVA" w:date="2025-06-13T18:06:00Z" w16du:dateUtc="2025-06-13T21:06:00Z">
+      <w:ins w:id="244" w:author="BRUNO KAUAN RODRIGUES SILVA" w:date="2025-06-13T18:06:00Z" w16du:dateUtc="2025-06-13T21:06:00Z">
         <w:r>
           <w:rPr>
             <w:rFonts w:ascii="Arial" w:hAnsi="Arial" w:cs="Arial"/>
@@ -6259,7 +6413,7 @@
     <w:p>
       <w:pPr>
         <w:rPr>
-          <w:ins w:id="230" w:author="BRUNO KAUAN RODRIGUES SILVA" w:date="2025-06-13T18:06:00Z" w16du:dateUtc="2025-06-13T21:06:00Z"/>
+          <w:ins w:id="245" w:author="BRUNO KAUAN RODRIGUES SILVA" w:date="2025-06-13T18:06:00Z" w16du:dateUtc="2025-06-13T21:06:00Z"/>
           <w:rFonts w:ascii="Arial" w:hAnsi="Arial" w:cs="Arial"/>
           <w:color w:val="000000" w:themeColor="text1"/>
           <w:sz w:val="22"/>
@@ -6270,14 +6424,14 @@
     <w:p>
       <w:pPr>
         <w:rPr>
-          <w:ins w:id="231" w:author="BRUNO KAUAN RODRIGUES SILVA" w:date="2025-06-13T18:06:00Z" w16du:dateUtc="2025-06-13T21:06:00Z"/>
+          <w:ins w:id="246" w:author="BRUNO KAUAN RODRIGUES SILVA" w:date="2025-06-13T18:06:00Z" w16du:dateUtc="2025-06-13T21:06:00Z"/>
           <w:rFonts w:ascii="Arial" w:hAnsi="Arial" w:cs="Arial"/>
           <w:color w:val="000000" w:themeColor="text1"/>
           <w:sz w:val="22"/>
           <w:szCs w:val="22"/>
         </w:rPr>
       </w:pPr>
-      <w:ins w:id="232" w:author="BRUNO KAUAN RODRIGUES SILVA" w:date="2025-06-13T18:06:00Z" w16du:dateUtc="2025-06-13T21:06:00Z">
+      <w:ins w:id="247" w:author="BRUNO KAUAN RODRIGUES SILVA" w:date="2025-06-13T18:06:00Z" w16du:dateUtc="2025-06-13T21:06:00Z">
         <w:r>
           <w:rPr>
             <w:rFonts w:ascii="Arial" w:hAnsi="Arial" w:cs="Arial"/>
@@ -6292,7 +6446,7 @@
     <w:p>
       <w:pPr>
         <w:rPr>
-          <w:ins w:id="233" w:author="BRUNO KAUAN RODRIGUES SILVA" w:date="2025-06-13T18:06:00Z" w16du:dateUtc="2025-06-13T21:06:00Z"/>
+          <w:ins w:id="248" w:author="BRUNO KAUAN RODRIGUES SILVA" w:date="2025-06-13T18:06:00Z" w16du:dateUtc="2025-06-13T21:06:00Z"/>
           <w:rFonts w:ascii="Arial" w:hAnsi="Arial" w:cs="Arial"/>
           <w:color w:val="000000" w:themeColor="text1"/>
           <w:sz w:val="22"/>
@@ -6303,14 +6457,14 @@
     <w:p>
       <w:pPr>
         <w:rPr>
-          <w:ins w:id="234" w:author="BRUNO KAUAN RODRIGUES SILVA" w:date="2025-06-13T18:06:00Z" w16du:dateUtc="2025-06-13T21:06:00Z"/>
+          <w:ins w:id="249" w:author="BRUNO KAUAN RODRIGUES SILVA" w:date="2025-06-13T18:06:00Z" w16du:dateUtc="2025-06-13T21:06:00Z"/>
           <w:rFonts w:ascii="Arial" w:hAnsi="Arial" w:cs="Arial"/>
           <w:color w:val="000000" w:themeColor="text1"/>
           <w:sz w:val="22"/>
           <w:szCs w:val="22"/>
         </w:rPr>
       </w:pPr>
-      <w:ins w:id="235" w:author="BRUNO KAUAN RODRIGUES SILVA" w:date="2025-06-13T18:06:00Z" w16du:dateUtc="2025-06-13T21:06:00Z">
+      <w:ins w:id="250" w:author="BRUNO KAUAN RODRIGUES SILVA" w:date="2025-06-13T18:06:00Z" w16du:dateUtc="2025-06-13T21:06:00Z">
         <w:r>
           <w:rPr>
             <w:rFonts w:ascii="Arial" w:hAnsi="Arial" w:cs="Arial"/>
@@ -6325,7 +6479,7 @@
     <w:p>
       <w:pPr>
         <w:rPr>
-          <w:ins w:id="236" w:author="BRUNO KAUAN RODRIGUES SILVA" w:date="2025-06-13T18:06:00Z" w16du:dateUtc="2025-06-13T21:06:00Z"/>
+          <w:ins w:id="251" w:author="BRUNO KAUAN RODRIGUES SILVA" w:date="2025-06-13T18:06:00Z" w16du:dateUtc="2025-06-13T21:06:00Z"/>
           <w:rFonts w:ascii="Arial" w:hAnsi="Arial" w:cs="Arial"/>
           <w:color w:val="000000" w:themeColor="text1"/>
           <w:sz w:val="22"/>
@@ -6336,14 +6490,14 @@
     <w:p>
       <w:pPr>
         <w:rPr>
-          <w:ins w:id="237" w:author="BRUNO KAUAN RODRIGUES SILVA" w:date="2025-06-13T18:06:00Z" w16du:dateUtc="2025-06-13T21:06:00Z"/>
+          <w:ins w:id="252" w:author="BRUNO KAUAN RODRIGUES SILVA" w:date="2025-06-13T18:06:00Z" w16du:dateUtc="2025-06-13T21:06:00Z"/>
           <w:rFonts w:ascii="Arial" w:hAnsi="Arial" w:cs="Arial"/>
           <w:color w:val="000000" w:themeColor="text1"/>
           <w:sz w:val="22"/>
           <w:szCs w:val="22"/>
         </w:rPr>
       </w:pPr>
-      <w:ins w:id="238" w:author="BRUNO KAUAN RODRIGUES SILVA" w:date="2025-06-13T18:06:00Z" w16du:dateUtc="2025-06-13T21:06:00Z">
+      <w:ins w:id="253" w:author="BRUNO KAUAN RODRIGUES SILVA" w:date="2025-06-13T18:06:00Z" w16du:dateUtc="2025-06-13T21:06:00Z">
         <w:r>
           <w:rPr>
             <w:rFonts w:ascii="Arial" w:hAnsi="Arial" w:cs="Arial"/>
@@ -6369,7 +6523,7 @@
     <w:p>
       <w:pPr>
         <w:rPr>
-          <w:ins w:id="239" w:author="BRUNO KAUAN RODRIGUES SILVA" w:date="2025-06-13T18:06:00Z" w16du:dateUtc="2025-06-13T21:06:00Z"/>
+          <w:ins w:id="254" w:author="BRUNO KAUAN RODRIGUES SILVA" w:date="2025-06-13T18:06:00Z" w16du:dateUtc="2025-06-13T21:06:00Z"/>
           <w:rFonts w:ascii="Arial" w:hAnsi="Arial" w:cs="Arial"/>
           <w:color w:val="000000" w:themeColor="text1"/>
           <w:sz w:val="22"/>
@@ -6380,14 +6534,14 @@
     <w:p>
       <w:pPr>
         <w:rPr>
-          <w:ins w:id="240" w:author="BRUNO KAUAN RODRIGUES SILVA" w:date="2025-06-13T18:06:00Z" w16du:dateUtc="2025-06-13T21:06:00Z"/>
+          <w:ins w:id="255" w:author="BRUNO KAUAN RODRIGUES SILVA" w:date="2025-06-13T18:06:00Z" w16du:dateUtc="2025-06-13T21:06:00Z"/>
           <w:rFonts w:ascii="Arial" w:hAnsi="Arial" w:cs="Arial"/>
           <w:color w:val="000000" w:themeColor="text1"/>
           <w:sz w:val="22"/>
           <w:szCs w:val="22"/>
         </w:rPr>
       </w:pPr>
-      <w:ins w:id="241" w:author="BRUNO KAUAN RODRIGUES SILVA" w:date="2025-06-13T18:06:00Z" w16du:dateUtc="2025-06-13T21:06:00Z">
+      <w:ins w:id="256" w:author="BRUNO KAUAN RODRIGUES SILVA" w:date="2025-06-13T18:06:00Z" w16du:dateUtc="2025-06-13T21:06:00Z">
         <w:r>
           <w:rPr>
             <w:rFonts w:ascii="Arial" w:hAnsi="Arial" w:cs="Arial"/>
@@ -6442,7 +6596,7 @@
     <w:p>
       <w:pPr>
         <w:rPr>
-          <w:ins w:id="242" w:author="BRUNO KAUAN RODRIGUES SILVA" w:date="2025-06-13T18:06:00Z" w16du:dateUtc="2025-06-13T21:06:00Z"/>
+          <w:ins w:id="257" w:author="BRUNO KAUAN RODRIGUES SILVA" w:date="2025-06-13T18:06:00Z" w16du:dateUtc="2025-06-13T21:06:00Z"/>
           <w:rFonts w:ascii="Arial" w:hAnsi="Arial" w:cs="Arial"/>
           <w:color w:val="000000" w:themeColor="text1"/>
           <w:sz w:val="22"/>
@@ -6453,14 +6607,14 @@
     <w:p>
       <w:pPr>
         <w:rPr>
-          <w:ins w:id="243" w:author="BRUNO KAUAN RODRIGUES SILVA" w:date="2025-06-13T18:06:00Z" w16du:dateUtc="2025-06-13T21:06:00Z"/>
+          <w:ins w:id="258" w:author="BRUNO KAUAN RODRIGUES SILVA" w:date="2025-06-13T18:06:00Z" w16du:dateUtc="2025-06-13T21:06:00Z"/>
           <w:rFonts w:ascii="Arial" w:hAnsi="Arial" w:cs="Arial"/>
           <w:color w:val="000000" w:themeColor="text1"/>
           <w:sz w:val="22"/>
           <w:szCs w:val="22"/>
         </w:rPr>
       </w:pPr>
-      <w:ins w:id="244" w:author="BRUNO KAUAN RODRIGUES SILVA" w:date="2025-06-13T18:06:00Z" w16du:dateUtc="2025-06-13T21:06:00Z">
+      <w:ins w:id="259" w:author="BRUNO KAUAN RODRIGUES SILVA" w:date="2025-06-13T18:06:00Z" w16du:dateUtc="2025-06-13T21:06:00Z">
         <w:r>
           <w:rPr>
             <w:rFonts w:ascii="Arial" w:hAnsi="Arial" w:cs="Arial"/>
@@ -6475,7 +6629,7 @@
     <w:p>
       <w:pPr>
         <w:rPr>
-          <w:ins w:id="245" w:author="BRUNO KAUAN RODRIGUES SILVA" w:date="2025-06-13T18:06:00Z" w16du:dateUtc="2025-06-13T21:06:00Z"/>
+          <w:ins w:id="260" w:author="BRUNO KAUAN RODRIGUES SILVA" w:date="2025-06-13T18:06:00Z" w16du:dateUtc="2025-06-13T21:06:00Z"/>
           <w:rFonts w:ascii="Arial" w:hAnsi="Arial" w:cs="Arial"/>
           <w:color w:val="000000" w:themeColor="text1"/>
           <w:sz w:val="22"/>
@@ -6486,14 +6640,14 @@
     <w:p>
       <w:pPr>
         <w:rPr>
-          <w:ins w:id="246" w:author="BRUNO KAUAN RODRIGUES SILVA" w:date="2025-06-13T18:06:00Z" w16du:dateUtc="2025-06-13T21:06:00Z"/>
+          <w:ins w:id="261" w:author="BRUNO KAUAN RODRIGUES SILVA" w:date="2025-06-13T18:06:00Z" w16du:dateUtc="2025-06-13T21:06:00Z"/>
           <w:rFonts w:ascii="Arial" w:hAnsi="Arial" w:cs="Arial"/>
           <w:color w:val="000000" w:themeColor="text1"/>
           <w:sz w:val="22"/>
           <w:szCs w:val="22"/>
         </w:rPr>
       </w:pPr>
-      <w:ins w:id="247" w:author="BRUNO KAUAN RODRIGUES SILVA" w:date="2025-06-13T18:06:00Z" w16du:dateUtc="2025-06-13T21:06:00Z">
+      <w:ins w:id="262" w:author="BRUNO KAUAN RODRIGUES SILVA" w:date="2025-06-13T18:06:00Z" w16du:dateUtc="2025-06-13T21:06:00Z">
         <w:r>
           <w:rPr>
             <w:rFonts w:ascii="Arial" w:hAnsi="Arial" w:cs="Arial"/>
@@ -6508,7 +6662,7 @@
     <w:p>
       <w:pPr>
         <w:rPr>
-          <w:ins w:id="248" w:author="BRUNO KAUAN RODRIGUES SILVA" w:date="2025-06-13T18:06:00Z" w16du:dateUtc="2025-06-13T21:06:00Z"/>
+          <w:ins w:id="263" w:author="BRUNO KAUAN RODRIGUES SILVA" w:date="2025-06-13T18:06:00Z" w16du:dateUtc="2025-06-13T21:06:00Z"/>
           <w:rFonts w:ascii="Arial" w:hAnsi="Arial" w:cs="Arial"/>
           <w:color w:val="000000" w:themeColor="text1"/>
           <w:sz w:val="22"/>
@@ -6519,14 +6673,14 @@
     <w:p>
       <w:pPr>
         <w:rPr>
-          <w:ins w:id="249" w:author="BRUNO KAUAN RODRIGUES SILVA" w:date="2025-06-13T18:06:00Z" w16du:dateUtc="2025-06-13T21:06:00Z"/>
+          <w:ins w:id="264" w:author="BRUNO KAUAN RODRIGUES SILVA" w:date="2025-06-13T18:06:00Z" w16du:dateUtc="2025-06-13T21:06:00Z"/>
           <w:rFonts w:ascii="Arial" w:hAnsi="Arial" w:cs="Arial"/>
           <w:color w:val="000000" w:themeColor="text1"/>
           <w:sz w:val="22"/>
           <w:szCs w:val="22"/>
         </w:rPr>
       </w:pPr>
-      <w:ins w:id="250" w:author="BRUNO KAUAN RODRIGUES SILVA" w:date="2025-06-13T18:06:00Z" w16du:dateUtc="2025-06-13T21:06:00Z">
+      <w:ins w:id="265" w:author="BRUNO KAUAN RODRIGUES SILVA" w:date="2025-06-13T18:06:00Z" w16du:dateUtc="2025-06-13T21:06:00Z">
         <w:r>
           <w:rPr>
             <w:rFonts w:ascii="Arial" w:hAnsi="Arial" w:cs="Arial"/>
@@ -6561,7 +6715,7 @@
     <w:p>
       <w:pPr>
         <w:rPr>
-          <w:ins w:id="251" w:author="BRUNO KAUAN RODRIGUES SILVA" w:date="2025-06-13T18:06:00Z" w16du:dateUtc="2025-06-13T21:06:00Z"/>
+          <w:ins w:id="266" w:author="BRUNO KAUAN RODRIGUES SILVA" w:date="2025-06-13T18:06:00Z" w16du:dateUtc="2025-06-13T21:06:00Z"/>
           <w:rFonts w:ascii="Arial" w:hAnsi="Arial" w:cs="Arial"/>
           <w:color w:val="000000" w:themeColor="text1"/>
           <w:sz w:val="22"/>
@@ -6572,14 +6726,14 @@
     <w:p>
       <w:pPr>
         <w:rPr>
-          <w:ins w:id="252" w:author="BRUNO KAUAN RODRIGUES SILVA" w:date="2025-06-13T18:06:00Z" w16du:dateUtc="2025-06-13T21:06:00Z"/>
+          <w:ins w:id="267" w:author="BRUNO KAUAN RODRIGUES SILVA" w:date="2025-06-13T18:06:00Z" w16du:dateUtc="2025-06-13T21:06:00Z"/>
           <w:rFonts w:ascii="Arial" w:hAnsi="Arial" w:cs="Arial"/>
           <w:color w:val="000000" w:themeColor="text1"/>
           <w:sz w:val="22"/>
           <w:szCs w:val="22"/>
         </w:rPr>
       </w:pPr>
-      <w:ins w:id="253" w:author="BRUNO KAUAN RODRIGUES SILVA" w:date="2025-06-13T18:06:00Z" w16du:dateUtc="2025-06-13T21:06:00Z">
+      <w:ins w:id="268" w:author="BRUNO KAUAN RODRIGUES SILVA" w:date="2025-06-13T18:06:00Z" w16du:dateUtc="2025-06-13T21:06:00Z">
         <w:r>
           <w:rPr>
             <w:rFonts w:ascii="Arial" w:hAnsi="Arial" w:cs="Arial"/>
@@ -6595,12 +6749,12 @@
       <w:pPr>
         <w:jc w:val="both"/>
         <w:rPr>
-          <w:del w:id="254" w:author="BRUNO KAUAN RODRIGUES SILVA" w:date="2025-06-13T18:04:00Z" w16du:dateUtc="2025-06-13T21:04:00Z"/>
+          <w:del w:id="269" w:author="BRUNO KAUAN RODRIGUES SILVA" w:date="2025-06-13T18:04:00Z" w16du:dateUtc="2025-06-13T21:04:00Z"/>
           <w:rFonts w:ascii="Arial" w:hAnsi="Arial" w:cs="Arial"/>
           <w:color w:val="FF0000"/>
         </w:rPr>
       </w:pPr>
-      <w:del w:id="255" w:author="BRUNO KAUAN RODRIGUES SILVA" w:date="2025-06-13T18:04:00Z" w16du:dateUtc="2025-06-13T21:04:00Z">
+      <w:del w:id="270" w:author="BRUNO KAUAN RODRIGUES SILVA" w:date="2025-06-13T18:04:00Z" w16du:dateUtc="2025-06-13T21:04:00Z">
         <w:r>
           <w:rPr>
             <w:rFonts w:ascii="Arial" w:hAnsi="Arial" w:cs="Arial"/>
@@ -6646,7 +6800,7 @@
       <w:pPr>
         <w:jc w:val="both"/>
         <w:rPr>
-          <w:del w:id="256" w:author="BRUNO KAUAN RODRIGUES SILVA" w:date="2025-06-13T18:04:00Z" w16du:dateUtc="2025-06-13T21:04:00Z"/>
+          <w:del w:id="271" w:author="BRUNO KAUAN RODRIGUES SILVA" w:date="2025-06-13T18:04:00Z" w16du:dateUtc="2025-06-13T21:04:00Z"/>
           <w:rFonts w:ascii="Arial" w:hAnsi="Arial" w:cs="Arial"/>
           <w:color w:val="C00000"/>
         </w:rPr>
@@ -7654,7 +7808,6 @@
   <w:style w:type="character" w:default="1" w:styleId="Fontepargpadro">
     <w:name w:val="Default Paragraph Font"/>
     <w:uiPriority w:val="1"/>
-    <w:semiHidden/>
     <w:unhideWhenUsed/>
   </w:style>
   <w:style w:type="table" w:default="1" w:styleId="Tabelanormal">

</xml_diff>